<commit_message>
chore: update professional CV document and remove temporary lock file
</commit_message>
<xml_diff>
--- a/Amjad_Awad_CV_Professional.docx
+++ b/Amjad_Awad_CV_Professional.docx
@@ -2,35 +2,71 @@
 <file path=word/document.xml><?xml version="1.0" encoding="utf-8"?>
 <w:document xmlns:wpc="http://schemas.microsoft.com/office/word/2010/wordprocessingCanvas" xmlns:mo="http://schemas.microsoft.com/office/mac/office/2008/main" xmlns:mc="http://schemas.openxmlformats.org/markup-compatibility/2006" xmlns:mv="urn:schemas-microsoft-com:mac:vml" xmlns:o="urn:schemas-microsoft-com:office:office" xmlns:r="http://schemas.openxmlformats.org/officeDocument/2006/relationships" xmlns:m="http://schemas.openxmlformats.org/officeDocument/2006/math" xmlns:v="urn:schemas-microsoft-com:vml" xmlns:wp14="http://schemas.microsoft.com/office/word/2010/wordprocessingDrawing" xmlns:wp="http://schemas.openxmlformats.org/drawingml/2006/wordprocessingDrawing" xmlns:w10="urn:schemas-microsoft-com:office:word" xmlns:w="http://schemas.openxmlformats.org/wordprocessingml/2006/main" xmlns:w14="http://schemas.microsoft.com/office/word/2010/wordml" xmlns:wpg="http://schemas.microsoft.com/office/word/2010/wordprocessingGroup" xmlns:wpi="http://schemas.microsoft.com/office/word/2010/wordprocessingInk" xmlns:wne="http://schemas.microsoft.com/office/word/2006/wordml" xmlns:wps="http://schemas.microsoft.com/office/word/2010/wordprocessingShape" mc:Ignorable="w14 wp14">
   <w:body>
+    <w:tbl>
+      <w:tblPr>
+        <w:tblW w:type="auto" w:w="0"/>
+        <w:tblLayout w:type="fixed"/>
+        <w:tblLook w:firstColumn="1" w:firstRow="1" w:lastColumn="0" w:lastRow="0" w:noHBand="0" w:noVBand="1" w:val="04A0"/>
+      </w:tblPr>
+      <w:tblGrid>
+        <w:gridCol w:w="7488"/>
+        <w:gridCol w:w="2880"/>
+      </w:tblGrid>
+      <w:tr>
+        <w:tc>
+          <w:tcPr>
+            <w:tcW w:type="dxa" w:w="5256"/>
+          </w:tcPr>
+          <w:p>
+            <w:r>
+              <w:rPr>
+                <w:b/>
+                <w:color w:val="003366"/>
+                <w:sz w:val="44"/>
+              </w:rPr>
+              <w:t>Amjad Awad-Allah</w:t>
+              <w:br/>
+            </w:r>
+            <w:r>
+              <w:rPr>
+                <w:sz w:val="20"/>
+              </w:rPr>
+              <w:t>amjad.awadallah93@gmail.com | +49 163 9055276</w:t>
+              <w:br/>
+              <w:t>45307 Essen (Großraum Gelsenkirchen)</w:t>
+              <w:br/>
+              <w:t>linkedin.com/in/amjad-awad-allah | github.com/amjad-awad-allah</w:t>
+              <w:br/>
+              <w:t>amjadawadallah.com</w:t>
+            </w:r>
+          </w:p>
+        </w:tc>
+        <w:tc>
+          <w:tcPr>
+            <w:tcW w:type="dxa" w:w="5256"/>
+          </w:tcPr>
+          <w:p>
+            <w:pPr>
+              <w:jc w:val="right"/>
+            </w:pPr>
+            <w:r>
+              <w:rPr>
+                <w:i/>
+                <w:color w:val="787878"/>
+              </w:rPr>
+              <w:br/>
+              <w:br/>
+              <w:t>[ Platzhalter für</w:t>
+              <w:br/>
+              <w:t xml:space="preserve"> Bewerbungsfoto ]</w:t>
+            </w:r>
+          </w:p>
+        </w:tc>
+      </w:tr>
+    </w:tbl>
     <w:p>
       <w:pPr>
-        <w:jc w:val="center"/>
-      </w:pPr>
-      <w:r>
-        <w:rPr>
-          <w:b/>
-          <w:color w:val="004789"/>
-          <w:sz w:val="44"/>
-        </w:rPr>
-        <w:t>Amjad Awad-Allah</w:t>
-        <w:br/>
-      </w:r>
-      <w:r>
-        <w:rPr>
-          <w:sz w:val="20"/>
-        </w:rPr>
-        <w:t>amjad.awadallah93@gmail.com | +49 163 9055276 | 45307 Essen</w:t>
-        <w:br/>
-      </w:r>
-      <w:r>
-        <w:rPr>
-          <w:sz w:val="20"/>
-        </w:rPr>
-        <w:t>linkedin.com/in/amjad-awad-allah | github.com/amjad-awad-allah | amjadawadallah.com</w:t>
-      </w:r>
-    </w:p>
-    <w:p>
-      <w:pPr>
+        <w:spacing w:after="40"/>
         <w:jc w:val="center"/>
       </w:pPr>
       <w:r>
@@ -42,46 +78,50 @@
     </w:p>
     <w:p>
       <w:pPr>
-        <w:pStyle w:val="Heading1"/>
+        <w:spacing w:before="120" w:after="40"/>
       </w:pPr>
       <w:r>
         <w:rPr>
           <w:b/>
-          <w:color w:val="004789"/>
-          <w:sz w:val="26"/>
+          <w:color w:val="003366"/>
+          <w:sz w:val="24"/>
         </w:rPr>
         <w:t>PROFIL</w:t>
       </w:r>
     </w:p>
     <w:p>
       <w:pPr>
+        <w:spacing w:after="40"/>
         <w:jc w:val="both"/>
       </w:pPr>
       <w:r>
+        <w:rPr>
+          <w:sz w:val="20"/>
+        </w:rPr>
         <w:t>Android-Entwickler mit mehrjähriger Erfahrung in der Entwicklung von Mobile- und Backend-Lösungen für internationale Kunden. Spezialisiert auf Java, Kotlin und REST-APIs mit Fokus auf wartbare Architekturen und Clean Code. Aktuell in der Umschulung zum Fachinformatiker für Anwendungsentwicklung. Suche ein 11-monatiges Pflichtpraktikum ab Juli 2026 im Bereich Softwareentwicklung.</w:t>
       </w:r>
     </w:p>
     <w:p>
       <w:pPr>
-        <w:pStyle w:val="Heading1"/>
+        <w:spacing w:before="120" w:after="40"/>
       </w:pPr>
       <w:r>
         <w:rPr>
           <w:b/>
-          <w:color w:val="004789"/>
-          <w:sz w:val="26"/>
+          <w:color w:val="003366"/>
+          <w:sz w:val="24"/>
         </w:rPr>
         <w:t>BERUFSERFAHRUNG</w:t>
       </w:r>
     </w:p>
     <w:p>
       <w:pPr>
-        <w:spacing w:after="40"/>
+        <w:spacing w:after="0"/>
       </w:pPr>
       <w:r>
         <w:rPr>
           <w:b/>
-          <w:sz w:val="22"/>
+          <w:sz w:val="20"/>
         </w:rPr>
         <w:t>Freelance Software-Entwickler (Teilzeit) | Remote</w:t>
       </w:r>
@@ -89,15 +129,15 @@
         <w:rPr>
           <w:i/>
           <w:color w:val="646464"/>
-          <w:sz w:val="20"/>
+          <w:sz w:val="18"/>
         </w:rPr>
-        <w:t xml:space="preserve">  [07/2021 – 05/2025]</w:t>
+        <w:t xml:space="preserve"> | 07/2021 – 05/2025</w:t>
       </w:r>
     </w:p>
     <w:p>
       <w:pPr>
         <w:pStyle w:val="ListBullet"/>
-        <w:spacing w:after="40"/>
+        <w:spacing w:after="20"/>
       </w:pPr>
       <w:r>
         <w:rPr>
@@ -109,7 +149,7 @@
     <w:p>
       <w:pPr>
         <w:pStyle w:val="ListBullet"/>
-        <w:spacing w:after="40"/>
+        <w:spacing w:after="20"/>
       </w:pPr>
       <w:r>
         <w:rPr>
@@ -121,7 +161,7 @@
     <w:p>
       <w:pPr>
         <w:pStyle w:val="ListBullet"/>
-        <w:spacing w:after="40"/>
+        <w:spacing w:after="20"/>
       </w:pPr>
       <w:r>
         <w:rPr>
@@ -133,7 +173,7 @@
     <w:p>
       <w:pPr>
         <w:pStyle w:val="ListBullet"/>
-        <w:spacing w:after="40"/>
+        <w:spacing w:after="20"/>
       </w:pPr>
       <w:r>
         <w:rPr>
@@ -144,17 +184,12 @@
     </w:p>
     <w:p>
       <w:pPr>
-        <w:spacing w:after="80"/>
-      </w:pPr>
-    </w:p>
-    <w:p>
-      <w:pPr>
-        <w:spacing w:after="40"/>
+        <w:spacing w:after="0"/>
       </w:pPr>
       <w:r>
         <w:rPr>
           <w:b/>
-          <w:sz w:val="22"/>
+          <w:sz w:val="20"/>
         </w:rPr>
         <w:t>Android-Entwickler | NVS-SOFT, Dubai (VAE)</w:t>
       </w:r>
@@ -162,15 +197,15 @@
         <w:rPr>
           <w:i/>
           <w:color w:val="646464"/>
-          <w:sz w:val="20"/>
+          <w:sz w:val="18"/>
         </w:rPr>
-        <w:t xml:space="preserve">  [01/2018 – 09/2021]</w:t>
+        <w:t xml:space="preserve"> | 01/2018 – 09/2021</w:t>
       </w:r>
     </w:p>
     <w:p>
       <w:pPr>
         <w:pStyle w:val="ListBullet"/>
-        <w:spacing w:after="40"/>
+        <w:spacing w:after="20"/>
       </w:pPr>
       <w:r>
         <w:rPr>
@@ -182,7 +217,7 @@
     <w:p>
       <w:pPr>
         <w:pStyle w:val="ListBullet"/>
-        <w:spacing w:after="40"/>
+        <w:spacing w:after="20"/>
       </w:pPr>
       <w:r>
         <w:rPr>
@@ -194,7 +229,7 @@
     <w:p>
       <w:pPr>
         <w:pStyle w:val="ListBullet"/>
-        <w:spacing w:after="40"/>
+        <w:spacing w:after="20"/>
       </w:pPr>
       <w:r>
         <w:rPr>
@@ -206,7 +241,7 @@
     <w:p>
       <w:pPr>
         <w:pStyle w:val="ListBullet"/>
-        <w:spacing w:after="40"/>
+        <w:spacing w:after="20"/>
       </w:pPr>
       <w:r>
         <w:rPr>
@@ -217,17 +252,12 @@
     </w:p>
     <w:p>
       <w:pPr>
-        <w:spacing w:after="80"/>
-      </w:pPr>
-    </w:p>
-    <w:p>
-      <w:pPr>
-        <w:spacing w:after="40"/>
+        <w:spacing w:after="0"/>
       </w:pPr>
       <w:r>
         <w:rPr>
           <w:b/>
-          <w:sz w:val="22"/>
+          <w:sz w:val="20"/>
         </w:rPr>
         <w:t>Android-Entwickler (Remote, Teilzeit) | SmartAngle, Irak</w:t>
       </w:r>
@@ -235,15 +265,15 @@
         <w:rPr>
           <w:i/>
           <w:color w:val="646464"/>
-          <w:sz w:val="20"/>
+          <w:sz w:val="18"/>
         </w:rPr>
-        <w:t xml:space="preserve">  [05/2020 – 03/2021]</w:t>
+        <w:t xml:space="preserve"> | 05/2020 – 03/2021</w:t>
       </w:r>
     </w:p>
     <w:p>
       <w:pPr>
         <w:pStyle w:val="ListBullet"/>
-        <w:spacing w:after="40"/>
+        <w:spacing w:after="20"/>
       </w:pPr>
       <w:r>
         <w:rPr>
@@ -255,7 +285,7 @@
     <w:p>
       <w:pPr>
         <w:pStyle w:val="ListBullet"/>
-        <w:spacing w:after="40"/>
+        <w:spacing w:after="20"/>
       </w:pPr>
       <w:r>
         <w:rPr>
@@ -267,7 +297,7 @@
     <w:p>
       <w:pPr>
         <w:pStyle w:val="ListBullet"/>
-        <w:spacing w:after="40"/>
+        <w:spacing w:after="20"/>
       </w:pPr>
       <w:r>
         <w:rPr>
@@ -278,17 +308,12 @@
     </w:p>
     <w:p>
       <w:pPr>
-        <w:spacing w:after="80"/>
-      </w:pPr>
-    </w:p>
-    <w:p>
-      <w:pPr>
-        <w:spacing w:after="40"/>
+        <w:spacing w:after="0"/>
       </w:pPr>
       <w:r>
         <w:rPr>
           <w:b/>
-          <w:sz w:val="22"/>
+          <w:sz w:val="20"/>
         </w:rPr>
         <w:t>Software-Entwickler | PRO-Tech Group, Syrien</w:t>
       </w:r>
@@ -296,15 +321,15 @@
         <w:rPr>
           <w:i/>
           <w:color w:val="646464"/>
-          <w:sz w:val="20"/>
+          <w:sz w:val="18"/>
         </w:rPr>
-        <w:t xml:space="preserve">  [02/2017 – 06/2018]</w:t>
+        <w:t xml:space="preserve"> | 02/2017 – 06/2018</w:t>
       </w:r>
     </w:p>
     <w:p>
       <w:pPr>
         <w:pStyle w:val="ListBullet"/>
-        <w:spacing w:after="40"/>
+        <w:spacing w:after="20"/>
       </w:pPr>
       <w:r>
         <w:rPr>
@@ -316,7 +341,7 @@
     <w:p>
       <w:pPr>
         <w:pStyle w:val="ListBullet"/>
-        <w:spacing w:after="40"/>
+        <w:spacing w:after="20"/>
       </w:pPr>
       <w:r>
         <w:rPr>
@@ -328,7 +353,7 @@
     <w:p>
       <w:pPr>
         <w:pStyle w:val="ListBullet"/>
-        <w:spacing w:after="40"/>
+        <w:spacing w:after="20"/>
       </w:pPr>
       <w:r>
         <w:rPr>
@@ -339,46 +364,41 @@
     </w:p>
     <w:p>
       <w:pPr>
-        <w:spacing w:after="80"/>
-      </w:pPr>
-    </w:p>
-    <w:p>
-      <w:pPr>
-        <w:pStyle w:val="Heading1"/>
+        <w:spacing w:before="120" w:after="40"/>
       </w:pPr>
       <w:r>
         <w:rPr>
           <w:b/>
-          <w:color w:val="004789"/>
-          <w:sz w:val="26"/>
+          <w:color w:val="003366"/>
+          <w:sz w:val="24"/>
         </w:rPr>
         <w:t>AUSBILDUNG</w:t>
       </w:r>
     </w:p>
     <w:p>
       <w:pPr>
-        <w:spacing w:after="40"/>
+        <w:spacing w:after="0"/>
       </w:pPr>
       <w:r>
         <w:rPr>
           <w:b/>
-          <w:sz w:val="22"/>
+          <w:sz w:val="20"/>
         </w:rPr>
-        <w:t>Umschulung zum Fachinformatiker | BFZ Essen</w:t>
+        <w:t>Umschulung zum Fachinformatiker für Anwendungsentwicklung | BFZ Essen</w:t>
       </w:r>
       <w:r>
         <w:rPr>
           <w:i/>
           <w:color w:val="646464"/>
-          <w:sz w:val="20"/>
+          <w:sz w:val="18"/>
         </w:rPr>
-        <w:t xml:space="preserve">  [01/2025 – heute]</w:t>
+        <w:t xml:space="preserve"> | 2025 – heute</w:t>
       </w:r>
     </w:p>
     <w:p>
       <w:pPr>
         <w:pStyle w:val="ListBullet"/>
-        <w:spacing w:after="40"/>
+        <w:spacing w:after="20"/>
       </w:pPr>
       <w:r>
         <w:rPr>
@@ -389,33 +409,28 @@
     </w:p>
     <w:p>
       <w:pPr>
-        <w:spacing w:after="80"/>
-      </w:pPr>
-    </w:p>
-    <w:p>
-      <w:pPr>
-        <w:spacing w:after="40"/>
+        <w:spacing w:after="0"/>
       </w:pPr>
       <w:r>
         <w:rPr>
           <w:b/>
-          <w:sz w:val="22"/>
+          <w:sz w:val="20"/>
         </w:rPr>
-        <w:t>B.Sc. Künstliche Intelligenz | AIU, Damaskus</w:t>
+        <w:t>B.Sc. Künstliche Intelligenz | Arab International University, Damaskus</w:t>
       </w:r>
       <w:r>
         <w:rPr>
           <w:i/>
           <w:color w:val="646464"/>
-          <w:sz w:val="20"/>
+          <w:sz w:val="18"/>
         </w:rPr>
-        <w:t xml:space="preserve">  [2012–2017]</w:t>
+        <w:t xml:space="preserve"> | 2012–2017</w:t>
       </w:r>
     </w:p>
     <w:p>
       <w:pPr>
         <w:pStyle w:val="ListBullet"/>
-        <w:spacing w:after="40"/>
+        <w:spacing w:after="20"/>
       </w:pPr>
       <w:r>
         <w:rPr>
@@ -426,25 +441,21 @@
     </w:p>
     <w:p>
       <w:pPr>
-        <w:spacing w:after="80"/>
-      </w:pPr>
-    </w:p>
-    <w:p>
-      <w:pPr>
-        <w:pStyle w:val="Heading1"/>
+        <w:spacing w:before="120" w:after="40"/>
       </w:pPr>
       <w:r>
         <w:rPr>
           <w:b/>
-          <w:color w:val="004789"/>
-          <w:sz w:val="26"/>
+          <w:color w:val="003366"/>
+          <w:sz w:val="24"/>
         </w:rPr>
         <w:t>TECHNISCHE KENNTNISSE</w:t>
       </w:r>
     </w:p>
     <w:p>
       <w:pPr>
-        <w:spacing w:after="40"/>
+        <w:spacing w:after="20"/>
+        <w:ind w:left="288"/>
       </w:pPr>
       <w:r>
         <w:rPr>
@@ -457,12 +468,13 @@
         <w:rPr>
           <w:sz w:val="20"/>
         </w:rPr>
-        <w:t>Sehr gut: Java, Kotlin | Gut: SQL, JavaScript | Grundkenntnisse: Python, C#, Spring Boot (in Ausb.)</w:t>
+        <w:t>Sehr gut: Java, Kotlin | Gute Kenntnisse: SQL, JavaScript | Grundkenntnisse: Python, C#, Spring Boot (in Ausbildung)</w:t>
       </w:r>
     </w:p>
     <w:p>
       <w:pPr>
-        <w:spacing w:after="40"/>
+        <w:spacing w:after="20"/>
+        <w:ind w:left="288"/>
       </w:pPr>
       <w:r>
         <w:rPr>
@@ -480,7 +492,8 @@
     </w:p>
     <w:p>
       <w:pPr>
-        <w:spacing w:after="40"/>
+        <w:spacing w:after="20"/>
+        <w:ind w:left="288"/>
       </w:pPr>
       <w:r>
         <w:rPr>
@@ -498,7 +511,8 @@
     </w:p>
     <w:p>
       <w:pPr>
-        <w:spacing w:after="40"/>
+        <w:spacing w:after="20"/>
+        <w:ind w:left="288"/>
       </w:pPr>
       <w:r>
         <w:rPr>
@@ -516,7 +530,8 @@
     </w:p>
     <w:p>
       <w:pPr>
-        <w:spacing w:after="40"/>
+        <w:spacing w:after="20"/>
+        <w:ind w:left="288"/>
       </w:pPr>
       <w:r>
         <w:rPr>
@@ -532,23 +547,22 @@
         <w:t>HTML5, CSS3, Responsive Design, Grundkenntnisse Unity</w:t>
       </w:r>
     </w:p>
-    <w:p/>
     <w:p>
       <w:pPr>
-        <w:pStyle w:val="Heading1"/>
+        <w:spacing w:before="120" w:after="40"/>
       </w:pPr>
       <w:r>
         <w:rPr>
           <w:b/>
-          <w:color w:val="004789"/>
-          <w:sz w:val="26"/>
+          <w:color w:val="003366"/>
+          <w:sz w:val="24"/>
         </w:rPr>
         <w:t>PROJEKTE (AUSWAHL)</w:t>
       </w:r>
     </w:p>
     <w:p>
       <w:pPr>
-        <w:spacing w:after="40"/>
+        <w:spacing w:after="0"/>
       </w:pPr>
       <w:r>
         <w:rPr>
@@ -561,7 +575,7 @@
     <w:p>
       <w:pPr>
         <w:pStyle w:val="ListBullet"/>
-        <w:spacing w:after="40"/>
+        <w:spacing w:after="20"/>
       </w:pPr>
       <w:r>
         <w:rPr>
@@ -573,7 +587,7 @@
     <w:p>
       <w:pPr>
         <w:pStyle w:val="ListBullet"/>
-        <w:spacing w:after="40"/>
+        <w:spacing w:after="20"/>
       </w:pPr>
       <w:r>
         <w:rPr>
@@ -585,7 +599,7 @@
     <w:p>
       <w:pPr>
         <w:pStyle w:val="ListBullet"/>
-        <w:spacing w:after="40"/>
+        <w:spacing w:after="20"/>
       </w:pPr>
       <w:r>
         <w:rPr>
@@ -596,12 +610,7 @@
     </w:p>
     <w:p>
       <w:pPr>
-        <w:spacing w:after="80"/>
-      </w:pPr>
-    </w:p>
-    <w:p>
-      <w:pPr>
-        <w:spacing w:after="40"/>
+        <w:spacing w:after="0"/>
       </w:pPr>
       <w:r>
         <w:rPr>
@@ -614,7 +623,7 @@
     <w:p>
       <w:pPr>
         <w:pStyle w:val="ListBullet"/>
-        <w:spacing w:after="40"/>
+        <w:spacing w:after="20"/>
       </w:pPr>
       <w:r>
         <w:rPr>
@@ -626,7 +635,7 @@
     <w:p>
       <w:pPr>
         <w:pStyle w:val="ListBullet"/>
-        <w:spacing w:after="40"/>
+        <w:spacing w:after="20"/>
       </w:pPr>
       <w:r>
         <w:rPr>
@@ -638,7 +647,7 @@
     <w:p>
       <w:pPr>
         <w:pStyle w:val="ListBullet"/>
-        <w:spacing w:after="40"/>
+        <w:spacing w:after="20"/>
       </w:pPr>
       <w:r>
         <w:rPr>
@@ -649,12 +658,7 @@
     </w:p>
     <w:p>
       <w:pPr>
-        <w:spacing w:after="80"/>
-      </w:pPr>
-    </w:p>
-    <w:p>
-      <w:pPr>
-        <w:spacing w:after="40"/>
+        <w:spacing w:after="0"/>
       </w:pPr>
       <w:r>
         <w:rPr>
@@ -667,7 +671,7 @@
     <w:p>
       <w:pPr>
         <w:pStyle w:val="ListBullet"/>
-        <w:spacing w:after="40"/>
+        <w:spacing w:after="20"/>
       </w:pPr>
       <w:r>
         <w:rPr>
@@ -679,7 +683,7 @@
     <w:p>
       <w:pPr>
         <w:pStyle w:val="ListBullet"/>
-        <w:spacing w:after="40"/>
+        <w:spacing w:after="20"/>
       </w:pPr>
       <w:r>
         <w:rPr>
@@ -691,7 +695,7 @@
     <w:p>
       <w:pPr>
         <w:pStyle w:val="ListBullet"/>
-        <w:spacing w:after="40"/>
+        <w:spacing w:after="20"/>
       </w:pPr>
       <w:r>
         <w:rPr>
@@ -702,12 +706,7 @@
     </w:p>
     <w:p>
       <w:pPr>
-        <w:spacing w:after="80"/>
-      </w:pPr>
-    </w:p>
-    <w:p>
-      <w:pPr>
-        <w:spacing w:after="40"/>
+        <w:spacing w:after="0"/>
       </w:pPr>
       <w:r>
         <w:rPr>
@@ -720,7 +719,7 @@
     <w:p>
       <w:pPr>
         <w:pStyle w:val="ListBullet"/>
-        <w:spacing w:after="40"/>
+        <w:spacing w:after="20"/>
       </w:pPr>
       <w:r>
         <w:rPr>
@@ -732,7 +731,7 @@
     <w:p>
       <w:pPr>
         <w:pStyle w:val="ListBullet"/>
-        <w:spacing w:after="40"/>
+        <w:spacing w:after="20"/>
       </w:pPr>
       <w:r>
         <w:rPr>
@@ -744,7 +743,7 @@
     <w:p>
       <w:pPr>
         <w:pStyle w:val="ListBullet"/>
-        <w:spacing w:after="40"/>
+        <w:spacing w:after="20"/>
       </w:pPr>
       <w:r>
         <w:rPr>
@@ -755,18 +754,13 @@
     </w:p>
     <w:p>
       <w:pPr>
-        <w:spacing w:after="80"/>
-      </w:pPr>
-    </w:p>
-    <w:p>
-      <w:pPr>
-        <w:pStyle w:val="Heading1"/>
+        <w:spacing w:before="120" w:after="40"/>
       </w:pPr>
       <w:r>
         <w:rPr>
           <w:b/>
-          <w:color w:val="004789"/>
-          <w:sz w:val="26"/>
+          <w:color w:val="003366"/>
+          <w:sz w:val="24"/>
         </w:rPr>
         <w:t>ZERTIFIKATE &amp; WEITERBILDUNG</w:t>
       </w:r>
@@ -774,19 +768,19 @@
     <w:p>
       <w:pPr>
         <w:pStyle w:val="ListBullet"/>
-        <w:spacing w:after="40"/>
+        <w:spacing w:after="20"/>
       </w:pPr>
       <w:r>
         <w:rPr>
           <w:sz w:val="20"/>
         </w:rPr>
-        <w:t>Cisco Networking Academy: Cybersecurity Analyst, Python, JavaScript, IoT, KI Grundlagen</w:t>
+        <w:t>Cisco Networking Academy: Cybersecurity Analyst, Python, JavaScript, IoT, Grundlagen Künstliche Intelligenz</w:t>
       </w:r>
     </w:p>
     <w:p>
       <w:pPr>
         <w:pStyle w:val="ListBullet"/>
-        <w:spacing w:after="40"/>
+        <w:spacing w:after="20"/>
       </w:pPr>
       <w:r>
         <w:rPr>
@@ -798,7 +792,7 @@
     <w:p>
       <w:pPr>
         <w:pStyle w:val="ListBullet"/>
-        <w:spacing w:after="40"/>
+        <w:spacing w:after="20"/>
       </w:pPr>
       <w:r>
         <w:rPr>
@@ -807,16 +801,15 @@
         <w:t>Jobcoaching &amp; Bewerbungstraining – Weststadt Akademie (2024–2025)</w:t>
       </w:r>
     </w:p>
-    <w:p/>
     <w:p>
       <w:pPr>
-        <w:pStyle w:val="Heading1"/>
+        <w:spacing w:before="120" w:after="40"/>
       </w:pPr>
       <w:r>
         <w:rPr>
           <w:b/>
-          <w:color w:val="004789"/>
-          <w:sz w:val="26"/>
+          <w:color w:val="003366"/>
+          <w:sz w:val="24"/>
         </w:rPr>
         <w:t>SPRACHEN</w:t>
       </w:r>
@@ -824,7 +817,7 @@
     <w:p>
       <w:pPr>
         <w:pStyle w:val="ListBullet"/>
-        <w:spacing w:after="40"/>
+        <w:spacing w:after="20"/>
       </w:pPr>
       <w:r>
         <w:rPr>
@@ -836,7 +829,7 @@
     <w:p>
       <w:pPr>
         <w:pStyle w:val="ListBullet"/>
-        <w:spacing w:after="40"/>
+        <w:spacing w:after="20"/>
       </w:pPr>
       <w:r>
         <w:rPr>
@@ -848,7 +841,7 @@
     <w:p>
       <w:pPr>
         <w:pStyle w:val="ListBullet"/>
-        <w:spacing w:after="40"/>
+        <w:spacing w:after="20"/>
       </w:pPr>
       <w:r>
         <w:rPr>
@@ -860,7 +853,7 @@
     <w:p>
       <w:pPr>
         <w:pStyle w:val="ListBullet"/>
-        <w:spacing w:after="40"/>
+        <w:spacing w:after="20"/>
       </w:pPr>
       <w:r>
         <w:rPr>
@@ -871,7 +864,7 @@
     </w:p>
     <w:sectPr>
       <w:pgSz w:w="12240" w:h="15840"/>
-      <w:pgMar w:top="864" w:right="1152" w:bottom="864" w:left="1152" w:header="720" w:footer="720" w:gutter="0"/>
+      <w:pgMar w:top="576" w:right="864" w:bottom="576" w:left="864" w:header="720" w:footer="720" w:gutter="0"/>
       <w:cols w:space="720"/>
       <w:docGrid w:linePitch="360"/>
     </w:sectPr>

</xml_diff>

<commit_message>
docs: update project documentation and remove temporary CV file
</commit_message>
<xml_diff>
--- a/Amjad_Awad_CV_Professional.docx
+++ b/Amjad_Awad_CV_Professional.docx
@@ -19,117 +19,57 @@
           </w:tcPr>
           <w:p>
             <w:pPr>
+              <w:spacing w:after="0"/>
               <w:rPr>
                 <w:rFonts w:asciiTheme="majorHAnsi" w:hAnsiTheme="majorHAnsi" w:cstheme="majorHAnsi"/>
-                <w:sz w:val="28"/>
-                <w:szCs w:val="28"/>
               </w:rPr>
             </w:pPr>
-            <w:proofErr w:type="spellStart"/>
+            <w:bookmarkStart w:id="0" w:name="_GoBack"/>
             <w:r>
               <w:rPr>
                 <w:rFonts w:asciiTheme="majorHAnsi" w:hAnsiTheme="majorHAnsi" w:cstheme="majorHAnsi"/>
                 <w:b/>
                 <w:color w:val="003366"/>
-                <w:sz w:val="52"/>
-                <w:szCs w:val="28"/>
-                <w:lang w:val="de-DE"/>
+                <w:sz w:val="44"/>
               </w:rPr>
-              <w:t>Amjad</w:t>
-            </w:r>
-            <w:proofErr w:type="spellEnd"/>
-            <w:r>
-              <w:rPr>
-                <w:rFonts w:asciiTheme="majorHAnsi" w:hAnsiTheme="majorHAnsi" w:cstheme="majorHAnsi"/>
-                <w:b/>
-                <w:color w:val="003366"/>
-                <w:sz w:val="52"/>
-                <w:szCs w:val="28"/>
-                <w:lang w:val="de-DE"/>
-              </w:rPr>
-              <w:t xml:space="preserve"> Awad-Allah</w:t>
+              <w:t>Amjad Awad-Allah</w:t>
             </w:r>
             <w:r>
               <w:rPr>
                 <w:rFonts w:asciiTheme="majorHAnsi" w:hAnsiTheme="majorHAnsi" w:cstheme="majorHAnsi"/>
                 <w:b/>
                 <w:color w:val="003366"/>
-                <w:sz w:val="52"/>
-                <w:szCs w:val="28"/>
-                <w:lang w:val="de-DE"/>
+                <w:sz w:val="44"/>
               </w:rPr>
               <w:br/>
             </w:r>
             <w:r>
               <w:rPr>
                 <w:rFonts w:asciiTheme="majorHAnsi" w:hAnsiTheme="majorHAnsi" w:cstheme="majorHAnsi"/>
-                <w:sz w:val="24"/>
-                <w:szCs w:val="28"/>
-                <w:lang w:val="de-DE"/>
+                <w:sz w:val="20"/>
               </w:rPr>
               <w:t>amjad.awadallah93@gmail.com | +49 163 9055276</w:t>
             </w:r>
             <w:r>
               <w:rPr>
                 <w:rFonts w:asciiTheme="majorHAnsi" w:hAnsiTheme="majorHAnsi" w:cstheme="majorHAnsi"/>
-                <w:sz w:val="24"/>
-                <w:szCs w:val="28"/>
-                <w:lang w:val="de-DE"/>
+                <w:sz w:val="20"/>
               </w:rPr>
               <w:br/>
-              <w:t xml:space="preserve">45307 Essen </w:t>
+              <w:t>45307 Essen (Großraum Gelsenkirchen)</w:t>
             </w:r>
             <w:r>
               <w:rPr>
                 <w:rFonts w:asciiTheme="majorHAnsi" w:hAnsiTheme="majorHAnsi" w:cstheme="majorHAnsi"/>
-                <w:sz w:val="24"/>
-                <w:szCs w:val="28"/>
-                <w:rtl/>
-                <w:lang w:val="de-DE"/>
+                <w:sz w:val="20"/>
               </w:rPr>
               <w:br/>
+              <w:t>linkedin.com/in/amjad-awad-allah | github.com/amjad-awad-allah</w:t>
             </w:r>
             <w:r>
               <w:rPr>
                 <w:rFonts w:asciiTheme="majorHAnsi" w:hAnsiTheme="majorHAnsi" w:cstheme="majorHAnsi"/>
-                <w:sz w:val="24"/>
-                <w:szCs w:val="28"/>
-              </w:rPr>
-              <w:t>linkedin.com/in/</w:t>
-            </w:r>
-            <w:proofErr w:type="spellStart"/>
-            <w:r>
-              <w:rPr>
-                <w:rFonts w:asciiTheme="majorHAnsi" w:hAnsiTheme="majorHAnsi" w:cstheme="majorHAnsi"/>
-                <w:sz w:val="24"/>
-                <w:szCs w:val="28"/>
-              </w:rPr>
-              <w:t>amjad-awad-allah</w:t>
-            </w:r>
-            <w:proofErr w:type="spellEnd"/>
-            <w:r>
-              <w:rPr>
-                <w:rFonts w:asciiTheme="majorHAnsi" w:hAnsiTheme="majorHAnsi" w:cstheme="majorHAnsi"/>
-                <w:sz w:val="24"/>
-                <w:szCs w:val="28"/>
-              </w:rPr>
-              <w:t xml:space="preserve"> | github.com/</w:t>
-            </w:r>
-            <w:proofErr w:type="spellStart"/>
-            <w:r>
-              <w:rPr>
-                <w:rFonts w:asciiTheme="majorHAnsi" w:hAnsiTheme="majorHAnsi" w:cstheme="majorHAnsi"/>
-                <w:sz w:val="24"/>
-                <w:szCs w:val="28"/>
-              </w:rPr>
-              <w:t>amjad-awad-allah</w:t>
-            </w:r>
-            <w:proofErr w:type="spellEnd"/>
-            <w:r>
-              <w:rPr>
-                <w:rFonts w:asciiTheme="majorHAnsi" w:hAnsiTheme="majorHAnsi" w:cstheme="majorHAnsi"/>
-                <w:sz w:val="24"/>
-                <w:szCs w:val="28"/>
+                <w:sz w:val="20"/>
               </w:rPr>
               <w:br/>
               <w:t>amjadawadallah.com</w:t>
@@ -142,13 +82,38 @@
           </w:tcPr>
           <w:p>
             <w:pPr>
+              <w:spacing w:after="0"/>
               <w:jc w:val="right"/>
               <w:rPr>
                 <w:rFonts w:asciiTheme="majorHAnsi" w:hAnsiTheme="majorHAnsi" w:cstheme="majorHAnsi"/>
-                <w:sz w:val="28"/>
-                <w:szCs w:val="28"/>
               </w:rPr>
             </w:pPr>
+            <w:r>
+              <w:rPr>
+                <w:rFonts w:asciiTheme="majorHAnsi" w:hAnsiTheme="majorHAnsi" w:cstheme="majorHAnsi"/>
+                <w:i/>
+                <w:color w:val="787878"/>
+              </w:rPr>
+              <w:br/>
+            </w:r>
+            <w:r>
+              <w:rPr>
+                <w:rFonts w:asciiTheme="majorHAnsi" w:hAnsiTheme="majorHAnsi" w:cstheme="majorHAnsi"/>
+                <w:i/>
+                <w:color w:val="787878"/>
+              </w:rPr>
+              <w:br/>
+              <w:t>[ Platzhalter für</w:t>
+            </w:r>
+            <w:r>
+              <w:rPr>
+                <w:rFonts w:asciiTheme="majorHAnsi" w:hAnsiTheme="majorHAnsi" w:cstheme="majorHAnsi"/>
+                <w:i/>
+                <w:color w:val="787878"/>
+              </w:rPr>
+              <w:br/>
+              <w:t xml:space="preserve"> Bewerbungsfoto ]</w:t>
+            </w:r>
           </w:p>
         </w:tc>
       </w:tr>
@@ -159,27 +124,14 @@
         <w:jc w:val="center"/>
         <w:rPr>
           <w:rFonts w:asciiTheme="majorHAnsi" w:hAnsiTheme="majorHAnsi" w:cstheme="majorHAnsi"/>
-          <w:sz w:val="28"/>
-          <w:szCs w:val="28"/>
         </w:rPr>
       </w:pPr>
       <w:r>
         <w:rPr>
           <w:rFonts w:asciiTheme="majorHAnsi" w:hAnsiTheme="majorHAnsi" w:cstheme="majorHAnsi"/>
           <w:color w:val="C8C8C8"/>
-          <w:sz w:val="28"/>
-          <w:szCs w:val="28"/>
-        </w:rPr>
-        <w:t>_____</w:t>
-      </w:r>
-      <w:r>
-        <w:rPr>
-          <w:rFonts w:asciiTheme="majorHAnsi" w:hAnsiTheme="majorHAnsi" w:cstheme="majorHAnsi"/>
-          <w:color w:val="C8C8C8"/>
-          <w:sz w:val="28"/>
-          <w:szCs w:val="28"/>
-        </w:rPr>
-        <w:t>__________________________________________________________</w:t>
+        </w:rPr>
+        <w:t>_________________________________________________________________</w:t>
       </w:r>
     </w:p>
     <w:p>
@@ -187,8 +139,6 @@
         <w:spacing w:before="120" w:after="40"/>
         <w:rPr>
           <w:rFonts w:asciiTheme="majorHAnsi" w:hAnsiTheme="majorHAnsi" w:cstheme="majorHAnsi"/>
-          <w:sz w:val="28"/>
-          <w:szCs w:val="28"/>
         </w:rPr>
       </w:pPr>
       <w:r>
@@ -196,8 +146,7 @@
           <w:rFonts w:asciiTheme="majorHAnsi" w:hAnsiTheme="majorHAnsi" w:cstheme="majorHAnsi"/>
           <w:b/>
           <w:color w:val="003366"/>
-          <w:sz w:val="32"/>
-          <w:szCs w:val="28"/>
+          <w:sz w:val="24"/>
         </w:rPr>
         <w:t>PROFIL</w:t>
       </w:r>
@@ -208,79 +157,24 @@
         <w:jc w:val="both"/>
         <w:rPr>
           <w:rFonts w:asciiTheme="majorHAnsi" w:hAnsiTheme="majorHAnsi" w:cstheme="majorHAnsi"/>
-          <w:sz w:val="28"/>
-          <w:szCs w:val="28"/>
           <w:lang w:val="de-DE"/>
         </w:rPr>
       </w:pPr>
       <w:r>
         <w:rPr>
           <w:rFonts w:asciiTheme="majorHAnsi" w:hAnsiTheme="majorHAnsi" w:cstheme="majorHAnsi"/>
-          <w:sz w:val="24"/>
-          <w:szCs w:val="28"/>
+          <w:sz w:val="20"/>
           <w:lang w:val="de-DE"/>
         </w:rPr>
-        <w:t xml:space="preserve">Android-Entwickler mit mehrjähriger Erfahrung in der Entwicklung von Mobile- und Backend-Lösungen für </w:t>
-      </w:r>
-      <w:bookmarkStart w:id="0" w:name="_GoBack"/>
-      <w:bookmarkEnd w:id="0"/>
-      <w:r>
-        <w:rPr>
-          <w:rFonts w:asciiTheme="majorHAnsi" w:hAnsiTheme="majorHAnsi" w:cstheme="majorHAnsi"/>
-          <w:sz w:val="24"/>
-          <w:szCs w:val="28"/>
-          <w:lang w:val="de-DE"/>
-        </w:rPr>
-        <w:t xml:space="preserve">internationale Kunden. Spezialisiert auf Java, </w:t>
-      </w:r>
-      <w:proofErr w:type="spellStart"/>
-      <w:r>
-        <w:rPr>
-          <w:rFonts w:asciiTheme="majorHAnsi" w:hAnsiTheme="majorHAnsi" w:cstheme="majorHAnsi"/>
-          <w:sz w:val="24"/>
-          <w:szCs w:val="28"/>
-          <w:lang w:val="de-DE"/>
-        </w:rPr>
-        <w:t>Kotlin</w:t>
-      </w:r>
-      <w:proofErr w:type="spellEnd"/>
-      <w:r>
-        <w:rPr>
-          <w:rFonts w:asciiTheme="majorHAnsi" w:hAnsiTheme="majorHAnsi" w:cstheme="majorHAnsi"/>
-          <w:sz w:val="24"/>
-          <w:szCs w:val="28"/>
-          <w:lang w:val="de-DE"/>
-        </w:rPr>
-        <w:t xml:space="preserve"> und REST-APIs mit Fokus auf</w:t>
+        <w:t>Android-Entwickler mit mehrjähriger Erfahrung in der Entwicklung von Mobile- und Backend-Lösungen für internationale Kunden. Spezialisiert auf Java, Kotlin und REST-APIs mit Fokus auf</w:t>
       </w:r>
       <w:r>
         <w:rPr>
           <w:rFonts w:asciiTheme="majorHAnsi" w:hAnsiTheme="majorHAnsi" w:cstheme="majorHAnsi"/>
-          <w:sz w:val="24"/>
-          <w:szCs w:val="28"/>
+          <w:sz w:val="20"/>
           <w:lang w:val="de-DE"/>
         </w:rPr>
-        <w:t xml:space="preserve"> </w:t>
-      </w:r>
-      <w:proofErr w:type="spellStart"/>
-      <w:r>
-        <w:rPr>
-          <w:rFonts w:asciiTheme="majorHAnsi" w:hAnsiTheme="majorHAnsi" w:cstheme="majorHAnsi"/>
-          <w:sz w:val="24"/>
-          <w:szCs w:val="28"/>
-          <w:lang w:val="de-DE"/>
-        </w:rPr>
-        <w:t>wartbare</w:t>
-      </w:r>
-      <w:proofErr w:type="spellEnd"/>
-      <w:r>
-        <w:rPr>
-          <w:rFonts w:asciiTheme="majorHAnsi" w:hAnsiTheme="majorHAnsi" w:cstheme="majorHAnsi"/>
-          <w:sz w:val="24"/>
-          <w:szCs w:val="28"/>
-          <w:lang w:val="de-DE"/>
-        </w:rPr>
-        <w:t xml:space="preserve"> Architekturen und Clean Code. Aktuell in der Umschulung zum Fachinformatiker für Anwendungsentwicklung. Suche ein 11-monatiges Pflichtpraktikum ab Juli 2026 im Bereich Softwareentwicklung.</w:t>
+        <w:t xml:space="preserve"> wartbare Architekturen und Clean Code. Aktuell in der Umschulung zum Fachinformatiker für Anwendungsentwicklung. Suche ein 11-monatiges Pflichtpraktikum ab Juli 2026 im Bereich Softwareentwicklung.</w:t>
       </w:r>
     </w:p>
     <w:p>
@@ -288,8 +182,6 @@
         <w:spacing w:before="120" w:after="40"/>
         <w:rPr>
           <w:rFonts w:asciiTheme="majorHAnsi" w:hAnsiTheme="majorHAnsi" w:cstheme="majorHAnsi"/>
-          <w:sz w:val="28"/>
-          <w:szCs w:val="28"/>
           <w:lang w:val="de-DE"/>
         </w:rPr>
       </w:pPr>
@@ -298,8 +190,7 @@
           <w:rFonts w:asciiTheme="majorHAnsi" w:hAnsiTheme="majorHAnsi" w:cstheme="majorHAnsi"/>
           <w:b/>
           <w:color w:val="003366"/>
-          <w:sz w:val="32"/>
-          <w:szCs w:val="28"/>
+          <w:sz w:val="24"/>
           <w:lang w:val="de-DE"/>
         </w:rPr>
         <w:t>BERUFSERFAHRUNG</w:t>
@@ -307,42 +198,29 @@
     </w:p>
     <w:p>
       <w:pPr>
+        <w:tabs>
+          <w:tab w:val="right" w:pos="10080"/>
+        </w:tabs>
         <w:spacing w:after="0"/>
         <w:rPr>
           <w:rFonts w:asciiTheme="majorHAnsi" w:hAnsiTheme="majorHAnsi" w:cstheme="majorHAnsi"/>
-          <w:sz w:val="28"/>
-          <w:szCs w:val="28"/>
           <w:lang w:val="de-DE"/>
         </w:rPr>
       </w:pPr>
-      <w:proofErr w:type="spellStart"/>
       <w:r>
         <w:rPr>
           <w:rFonts w:asciiTheme="majorHAnsi" w:hAnsiTheme="majorHAnsi" w:cstheme="majorHAnsi"/>
           <w:b/>
-          <w:sz w:val="24"/>
-          <w:szCs w:val="28"/>
+          <w:sz w:val="20"/>
           <w:lang w:val="de-DE"/>
         </w:rPr>
-        <w:t>Freelance</w:t>
-      </w:r>
-      <w:proofErr w:type="spellEnd"/>
-      <w:r>
-        <w:rPr>
-          <w:rFonts w:asciiTheme="majorHAnsi" w:hAnsiTheme="majorHAnsi" w:cstheme="majorHAnsi"/>
-          <w:b/>
-          <w:sz w:val="24"/>
-          <w:szCs w:val="28"/>
-          <w:lang w:val="de-DE"/>
-        </w:rPr>
-        <w:t xml:space="preserve"> Software-Entwickler (Teilzeit) </w:t>
+        <w:t xml:space="preserve">Freelance Software-Entwickler (Teilzeit) </w:t>
       </w:r>
       <w:r>
         <w:rPr>
           <w:rFonts w:asciiTheme="majorHAnsi" w:hAnsiTheme="majorHAnsi" w:cstheme="majorHAnsi"/>
           <w:b/>
-          <w:sz w:val="24"/>
-          <w:szCs w:val="28"/>
+          <w:sz w:val="20"/>
           <w:lang w:val="de-DE"/>
         </w:rPr>
         <w:t>| Remote</w:t>
@@ -352,10 +230,11 @@
           <w:rFonts w:asciiTheme="majorHAnsi" w:hAnsiTheme="majorHAnsi" w:cstheme="majorHAnsi"/>
           <w:i/>
           <w:color w:val="646464"/>
-          <w:szCs w:val="28"/>
+          <w:sz w:val="18"/>
           <w:lang w:val="de-DE"/>
         </w:rPr>
-        <w:t xml:space="preserve"> | 07/2021 – 05/2025</w:t>
+        <w:tab/>
+        <w:t>07/2021 – 05/2025</w:t>
       </w:r>
     </w:p>
     <w:p>
@@ -364,16 +243,13 @@
         <w:spacing w:after="20"/>
         <w:rPr>
           <w:rFonts w:asciiTheme="majorHAnsi" w:hAnsiTheme="majorHAnsi" w:cstheme="majorHAnsi"/>
-          <w:sz w:val="28"/>
-          <w:szCs w:val="28"/>
           <w:lang w:val="de-DE"/>
         </w:rPr>
       </w:pPr>
       <w:r>
         <w:rPr>
           <w:rFonts w:asciiTheme="majorHAnsi" w:hAnsiTheme="majorHAnsi" w:cstheme="majorHAnsi"/>
-          <w:sz w:val="24"/>
-          <w:szCs w:val="28"/>
+          <w:sz w:val="20"/>
           <w:lang w:val="de-DE"/>
         </w:rPr>
         <w:t>Entwicklung und Wartung von Android-Anwendungen für Kunden im Nahen Osten.</w:t>
@@ -385,16 +261,13 @@
         <w:spacing w:after="20"/>
         <w:rPr>
           <w:rFonts w:asciiTheme="majorHAnsi" w:hAnsiTheme="majorHAnsi" w:cstheme="majorHAnsi"/>
-          <w:sz w:val="28"/>
-          <w:szCs w:val="28"/>
           <w:lang w:val="de-DE"/>
         </w:rPr>
       </w:pPr>
       <w:r>
         <w:rPr>
           <w:rFonts w:asciiTheme="majorHAnsi" w:hAnsiTheme="majorHAnsi" w:cstheme="majorHAnsi"/>
-          <w:sz w:val="24"/>
-          <w:szCs w:val="28"/>
+          <w:sz w:val="20"/>
           <w:lang w:val="de-DE"/>
         </w:rPr>
         <w:t>Integration von REST-APIs und kontinuierliche Optimierung der App-Performance.</w:t>
@@ -406,28 +279,24 @@
         <w:spacing w:after="20"/>
         <w:rPr>
           <w:rFonts w:asciiTheme="majorHAnsi" w:hAnsiTheme="majorHAnsi" w:cstheme="majorHAnsi"/>
-          <w:sz w:val="28"/>
-          <w:szCs w:val="28"/>
           <w:lang w:val="de-DE"/>
         </w:rPr>
       </w:pPr>
       <w:r>
         <w:rPr>
           <w:rFonts w:asciiTheme="majorHAnsi" w:hAnsiTheme="majorHAnsi" w:cstheme="majorHAnsi"/>
-          <w:sz w:val="24"/>
-          <w:szCs w:val="28"/>
+          <w:sz w:val="20"/>
           <w:lang w:val="de-DE"/>
         </w:rPr>
-        <w:t>Anwendung von Clean-Code-Prinzipien und strukturierten Code-Reviews zur V</w:t>
+        <w:t>Anwendung von Clean-Code-Prinzipien und strukturierten Code-Reviews zur Ver</w:t>
       </w:r>
       <w:r>
         <w:rPr>
           <w:rFonts w:asciiTheme="majorHAnsi" w:hAnsiTheme="majorHAnsi" w:cstheme="majorHAnsi"/>
-          <w:sz w:val="24"/>
-          <w:szCs w:val="28"/>
+          <w:sz w:val="20"/>
           <w:lang w:val="de-DE"/>
         </w:rPr>
-        <w:t>erbesserung der Code-Qualität.</w:t>
+        <w:t>besserung der Code-Qualität.</w:t>
       </w:r>
     </w:p>
     <w:p>
@@ -436,16 +305,13 @@
         <w:spacing w:after="20"/>
         <w:rPr>
           <w:rFonts w:asciiTheme="majorHAnsi" w:hAnsiTheme="majorHAnsi" w:cstheme="majorHAnsi"/>
-          <w:sz w:val="28"/>
-          <w:szCs w:val="28"/>
           <w:lang w:val="de-DE"/>
         </w:rPr>
       </w:pPr>
       <w:r>
         <w:rPr>
           <w:rFonts w:asciiTheme="majorHAnsi" w:hAnsiTheme="majorHAnsi" w:cstheme="majorHAnsi"/>
-          <w:sz w:val="24"/>
-          <w:szCs w:val="28"/>
+          <w:sz w:val="20"/>
           <w:lang w:val="de-DE"/>
         </w:rPr>
         <w:t>Parallele Weiterbildung: Umschulung zum Fachinformatiker + Deutschkurse (B1 → B2).</w:t>
@@ -453,11 +319,12 @@
     </w:p>
     <w:p>
       <w:pPr>
+        <w:tabs>
+          <w:tab w:val="right" w:pos="10080"/>
+        </w:tabs>
         <w:spacing w:after="0"/>
         <w:rPr>
           <w:rFonts w:asciiTheme="majorHAnsi" w:hAnsiTheme="majorHAnsi" w:cstheme="majorHAnsi"/>
-          <w:sz w:val="28"/>
-          <w:szCs w:val="28"/>
           <w:lang w:val="de-DE"/>
         </w:rPr>
       </w:pPr>
@@ -465,8 +332,7 @@
         <w:rPr>
           <w:rFonts w:asciiTheme="majorHAnsi" w:hAnsiTheme="majorHAnsi" w:cstheme="majorHAnsi"/>
           <w:b/>
-          <w:sz w:val="24"/>
-          <w:szCs w:val="28"/>
+          <w:sz w:val="20"/>
           <w:lang w:val="de-DE"/>
         </w:rPr>
         <w:t>Android-Entwickler | NVS-SOFT, Dubai (VAE)</w:t>
@@ -476,10 +342,11 @@
           <w:rFonts w:asciiTheme="majorHAnsi" w:hAnsiTheme="majorHAnsi" w:cstheme="majorHAnsi"/>
           <w:i/>
           <w:color w:val="646464"/>
-          <w:szCs w:val="28"/>
+          <w:sz w:val="18"/>
           <w:lang w:val="de-DE"/>
         </w:rPr>
-        <w:t xml:space="preserve"> | 01/2018 – 09/2021</w:t>
+        <w:tab/>
+        <w:t>01/2018 – 09/2021</w:t>
       </w:r>
     </w:p>
     <w:p>
@@ -488,16 +355,13 @@
         <w:spacing w:after="20"/>
         <w:rPr>
           <w:rFonts w:asciiTheme="majorHAnsi" w:hAnsiTheme="majorHAnsi" w:cstheme="majorHAnsi"/>
-          <w:sz w:val="28"/>
-          <w:szCs w:val="28"/>
           <w:lang w:val="de-DE"/>
         </w:rPr>
       </w:pPr>
       <w:r>
         <w:rPr>
           <w:rFonts w:asciiTheme="majorHAnsi" w:hAnsiTheme="majorHAnsi" w:cstheme="majorHAnsi"/>
-          <w:sz w:val="24"/>
-          <w:szCs w:val="28"/>
+          <w:sz w:val="20"/>
           <w:lang w:val="de-DE"/>
         </w:rPr>
         <w:t>Entwicklung von Android-Anwendungen für Enterprise-Kunden in VAE und Kuwait.</w:t>
@@ -509,28 +373,24 @@
         <w:spacing w:after="20"/>
         <w:rPr>
           <w:rFonts w:asciiTheme="majorHAnsi" w:hAnsiTheme="majorHAnsi" w:cstheme="majorHAnsi"/>
-          <w:sz w:val="28"/>
-          <w:szCs w:val="28"/>
           <w:lang w:val="de-DE"/>
         </w:rPr>
       </w:pPr>
       <w:r>
         <w:rPr>
           <w:rFonts w:asciiTheme="majorHAnsi" w:hAnsiTheme="majorHAnsi" w:cstheme="majorHAnsi"/>
-          <w:sz w:val="24"/>
-          <w:szCs w:val="28"/>
+          <w:sz w:val="20"/>
           <w:lang w:val="de-DE"/>
         </w:rPr>
-        <w:t>Be</w:t>
+        <w:t>Betreu</w:t>
       </w:r>
       <w:r>
         <w:rPr>
           <w:rFonts w:asciiTheme="majorHAnsi" w:hAnsiTheme="majorHAnsi" w:cstheme="majorHAnsi"/>
-          <w:sz w:val="24"/>
-          <w:szCs w:val="28"/>
+          <w:sz w:val="20"/>
           <w:lang w:val="de-DE"/>
         </w:rPr>
-        <w:t>treuung von Softwarelösungen für staatliche Institutionen und große Unternehmen.</w:t>
+        <w:t>ung von Softwarelösungen für staatliche Institutionen und große Unternehmen.</w:t>
       </w:r>
     </w:p>
     <w:p>
@@ -539,16 +399,13 @@
         <w:spacing w:after="20"/>
         <w:rPr>
           <w:rFonts w:asciiTheme="majorHAnsi" w:hAnsiTheme="majorHAnsi" w:cstheme="majorHAnsi"/>
-          <w:sz w:val="28"/>
-          <w:szCs w:val="28"/>
           <w:lang w:val="de-DE"/>
         </w:rPr>
       </w:pPr>
       <w:r>
         <w:rPr>
           <w:rFonts w:asciiTheme="majorHAnsi" w:hAnsiTheme="majorHAnsi" w:cstheme="majorHAnsi"/>
-          <w:sz w:val="24"/>
-          <w:szCs w:val="28"/>
+          <w:sz w:val="20"/>
           <w:lang w:val="de-DE"/>
         </w:rPr>
         <w:t>Integration und Optimierung von REST-APIs für stabile Datenkommunikation.</w:t>
@@ -560,48 +417,26 @@
         <w:spacing w:after="20"/>
         <w:rPr>
           <w:rFonts w:asciiTheme="majorHAnsi" w:hAnsiTheme="majorHAnsi" w:cstheme="majorHAnsi"/>
-          <w:sz w:val="28"/>
-          <w:szCs w:val="28"/>
           <w:lang w:val="de-DE"/>
         </w:rPr>
       </w:pPr>
       <w:r>
         <w:rPr>
           <w:rFonts w:asciiTheme="majorHAnsi" w:hAnsiTheme="majorHAnsi" w:cstheme="majorHAnsi"/>
-          <w:sz w:val="24"/>
-          <w:szCs w:val="28"/>
+          <w:sz w:val="20"/>
           <w:lang w:val="de-DE"/>
         </w:rPr>
-        <w:t xml:space="preserve">Zusammenarbeit mit </w:t>
-      </w:r>
-      <w:proofErr w:type="spellStart"/>
-      <w:r>
-        <w:rPr>
-          <w:rFonts w:asciiTheme="majorHAnsi" w:hAnsiTheme="majorHAnsi" w:cstheme="majorHAnsi"/>
-          <w:sz w:val="24"/>
-          <w:szCs w:val="28"/>
-          <w:lang w:val="de-DE"/>
-        </w:rPr>
-        <w:t>cross</w:t>
-      </w:r>
-      <w:proofErr w:type="spellEnd"/>
-      <w:r>
-        <w:rPr>
-          <w:rFonts w:asciiTheme="majorHAnsi" w:hAnsiTheme="majorHAnsi" w:cstheme="majorHAnsi"/>
-          <w:sz w:val="24"/>
-          <w:szCs w:val="28"/>
-          <w:lang w:val="de-DE"/>
-        </w:rPr>
-        <w:t>-funktionalen Teams im agilen Umfeld.</w:t>
+        <w:t>Zusammenarbeit mit cross-funktionalen Teams im agilen Umfeld.</w:t>
       </w:r>
     </w:p>
     <w:p>
       <w:pPr>
+        <w:tabs>
+          <w:tab w:val="right" w:pos="10080"/>
+        </w:tabs>
         <w:spacing w:after="0"/>
         <w:rPr>
           <w:rFonts w:asciiTheme="majorHAnsi" w:hAnsiTheme="majorHAnsi" w:cstheme="majorHAnsi"/>
-          <w:sz w:val="28"/>
-          <w:szCs w:val="28"/>
           <w:lang w:val="de-DE"/>
         </w:rPr>
       </w:pPr>
@@ -609,53 +444,30 @@
         <w:rPr>
           <w:rFonts w:asciiTheme="majorHAnsi" w:hAnsiTheme="majorHAnsi" w:cstheme="majorHAnsi"/>
           <w:b/>
-          <w:sz w:val="24"/>
-          <w:szCs w:val="28"/>
+          <w:sz w:val="20"/>
           <w:lang w:val="de-DE"/>
         </w:rPr>
-        <w:t>Android-Entwickler (Remote, Teilzeit) |</w:t>
+        <w:t>Android-Entwickler (Remote, Teilzeit) | Sma</w:t>
       </w:r>
       <w:r>
         <w:rPr>
           <w:rFonts w:asciiTheme="majorHAnsi" w:hAnsiTheme="majorHAnsi" w:cstheme="majorHAnsi"/>
           <w:b/>
-          <w:sz w:val="24"/>
-          <w:szCs w:val="28"/>
+          <w:sz w:val="20"/>
           <w:lang w:val="de-DE"/>
         </w:rPr>
-        <w:t xml:space="preserve"> </w:t>
-      </w:r>
-      <w:proofErr w:type="spellStart"/>
-      <w:r>
-        <w:rPr>
-          <w:rFonts w:asciiTheme="majorHAnsi" w:hAnsiTheme="majorHAnsi" w:cstheme="majorHAnsi"/>
-          <w:b/>
-          <w:sz w:val="24"/>
-          <w:szCs w:val="28"/>
-          <w:lang w:val="de-DE"/>
-        </w:rPr>
-        <w:t>SmartAngle</w:t>
-      </w:r>
-      <w:proofErr w:type="spellEnd"/>
-      <w:r>
-        <w:rPr>
-          <w:rFonts w:asciiTheme="majorHAnsi" w:hAnsiTheme="majorHAnsi" w:cstheme="majorHAnsi"/>
-          <w:b/>
-          <w:sz w:val="24"/>
-          <w:szCs w:val="28"/>
-          <w:lang w:val="de-DE"/>
-        </w:rPr>
-        <w:t>, Irak</w:t>
+        <w:t>rtAngle, Irak</w:t>
       </w:r>
       <w:r>
         <w:rPr>
           <w:rFonts w:asciiTheme="majorHAnsi" w:hAnsiTheme="majorHAnsi" w:cstheme="majorHAnsi"/>
           <w:i/>
           <w:color w:val="646464"/>
-          <w:szCs w:val="28"/>
+          <w:sz w:val="18"/>
           <w:lang w:val="de-DE"/>
         </w:rPr>
-        <w:t xml:space="preserve"> | 05/2020 – 03/2021</w:t>
+        <w:tab/>
+        <w:t>05/2020 – 03/2021</w:t>
       </w:r>
     </w:p>
     <w:p>
@@ -664,39 +476,16 @@
         <w:spacing w:after="20"/>
         <w:rPr>
           <w:rFonts w:asciiTheme="majorHAnsi" w:hAnsiTheme="majorHAnsi" w:cstheme="majorHAnsi"/>
-          <w:sz w:val="28"/>
-          <w:szCs w:val="28"/>
           <w:lang w:val="de-DE"/>
         </w:rPr>
       </w:pPr>
       <w:r>
         <w:rPr>
           <w:rFonts w:asciiTheme="majorHAnsi" w:hAnsiTheme="majorHAnsi" w:cstheme="majorHAnsi"/>
-          <w:sz w:val="24"/>
-          <w:szCs w:val="28"/>
+          <w:sz w:val="20"/>
           <w:lang w:val="de-DE"/>
         </w:rPr>
-        <w:t xml:space="preserve">Umsetzung von Mobile-Lösungen im E-Learning- und </w:t>
-      </w:r>
-      <w:proofErr w:type="spellStart"/>
-      <w:r>
-        <w:rPr>
-          <w:rFonts w:asciiTheme="majorHAnsi" w:hAnsiTheme="majorHAnsi" w:cstheme="majorHAnsi"/>
-          <w:sz w:val="24"/>
-          <w:szCs w:val="28"/>
-          <w:lang w:val="de-DE"/>
-        </w:rPr>
-        <w:t>Social</w:t>
-      </w:r>
-      <w:proofErr w:type="spellEnd"/>
-      <w:r>
-        <w:rPr>
-          <w:rFonts w:asciiTheme="majorHAnsi" w:hAnsiTheme="majorHAnsi" w:cstheme="majorHAnsi"/>
-          <w:sz w:val="24"/>
-          <w:szCs w:val="28"/>
-          <w:lang w:val="de-DE"/>
-        </w:rPr>
-        <w:t>-Bereich mit internationalen Teams.</w:t>
+        <w:t>Umsetzung von Mobile-Lösungen im E-Learning- und Social-Bereich mit internationalen Teams.</w:t>
       </w:r>
     </w:p>
     <w:p>
@@ -705,16 +494,13 @@
         <w:spacing w:after="20"/>
         <w:rPr>
           <w:rFonts w:asciiTheme="majorHAnsi" w:hAnsiTheme="majorHAnsi" w:cstheme="majorHAnsi"/>
-          <w:sz w:val="28"/>
-          <w:szCs w:val="28"/>
           <w:lang w:val="de-DE"/>
         </w:rPr>
       </w:pPr>
       <w:r>
         <w:rPr>
           <w:rFonts w:asciiTheme="majorHAnsi" w:hAnsiTheme="majorHAnsi" w:cstheme="majorHAnsi"/>
-          <w:sz w:val="24"/>
-          <w:szCs w:val="28"/>
+          <w:sz w:val="20"/>
           <w:lang w:val="de-DE"/>
         </w:rPr>
         <w:t>Anforderungsanalyse und kundenspezifische Implementierung von Features.</w:t>
@@ -726,37 +512,34 @@
         <w:spacing w:after="20"/>
         <w:rPr>
           <w:rFonts w:asciiTheme="majorHAnsi" w:hAnsiTheme="majorHAnsi" w:cstheme="majorHAnsi"/>
-          <w:sz w:val="28"/>
-          <w:szCs w:val="28"/>
           <w:lang w:val="de-DE"/>
         </w:rPr>
       </w:pPr>
       <w:r>
         <w:rPr>
           <w:rFonts w:asciiTheme="majorHAnsi" w:hAnsiTheme="majorHAnsi" w:cstheme="majorHAnsi"/>
-          <w:sz w:val="24"/>
-          <w:szCs w:val="28"/>
+          <w:sz w:val="20"/>
           <w:lang w:val="de-DE"/>
         </w:rPr>
-        <w:t xml:space="preserve">Enge Abstimmung mit Kunden zur präzisen Umsetzung </w:t>
+        <w:t>Enge Abstimmung mit Kunden zur präzisen Umsetzung technischer</w:t>
       </w:r>
       <w:r>
         <w:rPr>
           <w:rFonts w:asciiTheme="majorHAnsi" w:hAnsiTheme="majorHAnsi" w:cstheme="majorHAnsi"/>
-          <w:sz w:val="24"/>
-          <w:szCs w:val="28"/>
+          <w:sz w:val="20"/>
           <w:lang w:val="de-DE"/>
         </w:rPr>
-        <w:t>technischer Spezifikationen.</w:t>
+        <w:t xml:space="preserve"> Spezifikationen.</w:t>
       </w:r>
     </w:p>
     <w:p>
       <w:pPr>
+        <w:tabs>
+          <w:tab w:val="right" w:pos="10080"/>
+        </w:tabs>
         <w:spacing w:after="0"/>
         <w:rPr>
           <w:rFonts w:asciiTheme="majorHAnsi" w:hAnsiTheme="majorHAnsi" w:cstheme="majorHAnsi"/>
-          <w:sz w:val="28"/>
-          <w:szCs w:val="28"/>
           <w:lang w:val="de-DE"/>
         </w:rPr>
       </w:pPr>
@@ -764,8 +547,7 @@
         <w:rPr>
           <w:rFonts w:asciiTheme="majorHAnsi" w:hAnsiTheme="majorHAnsi" w:cstheme="majorHAnsi"/>
           <w:b/>
-          <w:sz w:val="24"/>
-          <w:szCs w:val="28"/>
+          <w:sz w:val="20"/>
           <w:lang w:val="de-DE"/>
         </w:rPr>
         <w:t>Software-Entwickler | PRO-Tech Group, Syrien</w:t>
@@ -775,10 +557,11 @@
           <w:rFonts w:asciiTheme="majorHAnsi" w:hAnsiTheme="majorHAnsi" w:cstheme="majorHAnsi"/>
           <w:i/>
           <w:color w:val="646464"/>
-          <w:szCs w:val="28"/>
+          <w:sz w:val="18"/>
           <w:lang w:val="de-DE"/>
         </w:rPr>
-        <w:t xml:space="preserve"> | 02/2017 – 06/2018</w:t>
+        <w:tab/>
+        <w:t>02/2017 – 06/2018</w:t>
       </w:r>
     </w:p>
     <w:p>
@@ -787,16 +570,13 @@
         <w:spacing w:after="20"/>
         <w:rPr>
           <w:rFonts w:asciiTheme="majorHAnsi" w:hAnsiTheme="majorHAnsi" w:cstheme="majorHAnsi"/>
-          <w:sz w:val="28"/>
-          <w:szCs w:val="28"/>
           <w:lang w:val="de-DE"/>
         </w:rPr>
       </w:pPr>
       <w:r>
         <w:rPr>
           <w:rFonts w:asciiTheme="majorHAnsi" w:hAnsiTheme="majorHAnsi" w:cstheme="majorHAnsi"/>
-          <w:sz w:val="24"/>
-          <w:szCs w:val="28"/>
+          <w:sz w:val="20"/>
           <w:lang w:val="de-DE"/>
         </w:rPr>
         <w:t>Entwicklung von Mobile- und IPTV-Lösungen (TV-Box) für Internet- und Energieunternehmen.</w:t>
@@ -808,48 +588,16 @@
         <w:spacing w:after="20"/>
         <w:rPr>
           <w:rFonts w:asciiTheme="majorHAnsi" w:hAnsiTheme="majorHAnsi" w:cstheme="majorHAnsi"/>
-          <w:sz w:val="28"/>
-          <w:szCs w:val="28"/>
           <w:lang w:val="de-DE"/>
         </w:rPr>
       </w:pPr>
       <w:r>
         <w:rPr>
           <w:rFonts w:asciiTheme="majorHAnsi" w:hAnsiTheme="majorHAnsi" w:cstheme="majorHAnsi"/>
-          <w:sz w:val="24"/>
-          <w:szCs w:val="28"/>
+          <w:sz w:val="20"/>
           <w:lang w:val="de-DE"/>
         </w:rPr>
-        <w:t xml:space="preserve">Integration von </w:t>
-      </w:r>
-      <w:proofErr w:type="spellStart"/>
-      <w:r>
-        <w:rPr>
-          <w:rFonts w:asciiTheme="majorHAnsi" w:hAnsiTheme="majorHAnsi" w:cstheme="majorHAnsi"/>
-          <w:sz w:val="24"/>
-          <w:szCs w:val="28"/>
-          <w:lang w:val="de-DE"/>
-        </w:rPr>
-        <w:t>RESTful</w:t>
-      </w:r>
-      <w:proofErr w:type="spellEnd"/>
-      <w:r>
-        <w:rPr>
-          <w:rFonts w:asciiTheme="majorHAnsi" w:hAnsiTheme="majorHAnsi" w:cstheme="majorHAnsi"/>
-          <w:sz w:val="24"/>
-          <w:szCs w:val="28"/>
-          <w:lang w:val="de-DE"/>
-        </w:rPr>
-        <w:t xml:space="preserve"> APIs und Streaming-Protokollen mit Fokus auf Stab</w:t>
-      </w:r>
-      <w:r>
-        <w:rPr>
-          <w:rFonts w:asciiTheme="majorHAnsi" w:hAnsiTheme="majorHAnsi" w:cstheme="majorHAnsi"/>
-          <w:sz w:val="24"/>
-          <w:szCs w:val="28"/>
-          <w:lang w:val="de-DE"/>
-        </w:rPr>
-        <w:t>ilität.</w:t>
+        <w:t>Integration von RESTful APIs und Streaming-Protokollen mit Fokus auf Stabilität.</w:t>
       </w:r>
     </w:p>
     <w:p>
@@ -858,19 +606,24 @@
         <w:spacing w:after="20"/>
         <w:rPr>
           <w:rFonts w:asciiTheme="majorHAnsi" w:hAnsiTheme="majorHAnsi" w:cstheme="majorHAnsi"/>
-          <w:sz w:val="28"/>
-          <w:szCs w:val="28"/>
           <w:lang w:val="de-DE"/>
         </w:rPr>
       </w:pPr>
       <w:r>
         <w:rPr>
           <w:rFonts w:asciiTheme="majorHAnsi" w:hAnsiTheme="majorHAnsi" w:cstheme="majorHAnsi"/>
-          <w:sz w:val="24"/>
-          <w:szCs w:val="28"/>
+          <w:sz w:val="20"/>
           <w:lang w:val="de-DE"/>
         </w:rPr>
-        <w:t>Erstellung technischer Dokumentation und Anwendung von Clean-Code-Standards.</w:t>
+        <w:t>Erste</w:t>
+      </w:r>
+      <w:r>
+        <w:rPr>
+          <w:rFonts w:asciiTheme="majorHAnsi" w:hAnsiTheme="majorHAnsi" w:cstheme="majorHAnsi"/>
+          <w:sz w:val="20"/>
+          <w:lang w:val="de-DE"/>
+        </w:rPr>
+        <w:t>llung technischer Dokumentation und Anwendung von Clean-Code-Standards.</w:t>
       </w:r>
     </w:p>
     <w:p>
@@ -878,8 +631,6 @@
         <w:spacing w:before="120" w:after="40"/>
         <w:rPr>
           <w:rFonts w:asciiTheme="majorHAnsi" w:hAnsiTheme="majorHAnsi" w:cstheme="majorHAnsi"/>
-          <w:sz w:val="28"/>
-          <w:szCs w:val="28"/>
           <w:lang w:val="de-DE"/>
         </w:rPr>
       </w:pPr>
@@ -888,8 +639,7 @@
           <w:rFonts w:asciiTheme="majorHAnsi" w:hAnsiTheme="majorHAnsi" w:cstheme="majorHAnsi"/>
           <w:b/>
           <w:color w:val="003366"/>
-          <w:sz w:val="32"/>
-          <w:szCs w:val="28"/>
+          <w:sz w:val="24"/>
           <w:lang w:val="de-DE"/>
         </w:rPr>
         <w:t>AUSBILDUNG</w:t>
@@ -897,11 +647,12 @@
     </w:p>
     <w:p>
       <w:pPr>
+        <w:tabs>
+          <w:tab w:val="right" w:pos="10080"/>
+        </w:tabs>
         <w:spacing w:after="0"/>
         <w:rPr>
           <w:rFonts w:asciiTheme="majorHAnsi" w:hAnsiTheme="majorHAnsi" w:cstheme="majorHAnsi"/>
-          <w:sz w:val="28"/>
-          <w:szCs w:val="28"/>
           <w:lang w:val="de-DE"/>
         </w:rPr>
       </w:pPr>
@@ -909,21 +660,21 @@
         <w:rPr>
           <w:rFonts w:asciiTheme="majorHAnsi" w:hAnsiTheme="majorHAnsi" w:cstheme="majorHAnsi"/>
           <w:b/>
-          <w:sz w:val="24"/>
-          <w:szCs w:val="28"/>
+          <w:sz w:val="20"/>
           <w:lang w:val="de-DE"/>
         </w:rPr>
-        <w:t>Umschulung zum Fachinformatiker für Anwendungsentwicklung | BFZ Essen</w:t>
+        <w:t>Umschulung zum Fachinformatiker | BFZ Essen</w:t>
       </w:r>
       <w:r>
         <w:rPr>
           <w:rFonts w:asciiTheme="majorHAnsi" w:hAnsiTheme="majorHAnsi" w:cstheme="majorHAnsi"/>
           <w:i/>
           <w:color w:val="646464"/>
-          <w:szCs w:val="28"/>
+          <w:sz w:val="18"/>
           <w:lang w:val="de-DE"/>
         </w:rPr>
-        <w:t xml:space="preserve"> | 2025 – heute</w:t>
+        <w:tab/>
+        <w:t>2025 – heute</w:t>
       </w:r>
     </w:p>
     <w:p>
@@ -932,94 +683,56 @@
         <w:spacing w:after="20"/>
         <w:rPr>
           <w:rFonts w:asciiTheme="majorHAnsi" w:hAnsiTheme="majorHAnsi" w:cstheme="majorHAnsi"/>
-          <w:sz w:val="28"/>
-          <w:szCs w:val="28"/>
           <w:lang w:val="de-DE"/>
         </w:rPr>
       </w:pPr>
       <w:r>
         <w:rPr>
           <w:rFonts w:asciiTheme="majorHAnsi" w:hAnsiTheme="majorHAnsi" w:cstheme="majorHAnsi"/>
-          <w:sz w:val="24"/>
-          <w:szCs w:val="28"/>
+          <w:sz w:val="20"/>
           <w:lang w:val="de-DE"/>
         </w:rPr>
-        <w:t>Schwerpunkt: Objektorientierte Programmierung, Datenbanken, Software-Engine</w:t>
+        <w:t>Schwerpunkt: Objektorientierte Programmierung, Datenbanken, Software-Engineering, Agile Methoden, moderne Backend-Te</w:t>
       </w:r>
       <w:r>
         <w:rPr>
           <w:rFonts w:asciiTheme="majorHAnsi" w:hAnsiTheme="majorHAnsi" w:cstheme="majorHAnsi"/>
-          <w:sz w:val="24"/>
-          <w:szCs w:val="28"/>
+          <w:sz w:val="20"/>
           <w:lang w:val="de-DE"/>
         </w:rPr>
-        <w:t>ering, Agile Methoden, moderne Backend-Technologien (in Ausbildung).</w:t>
+        <w:t>chnologien (in Ausbildung).</w:t>
       </w:r>
     </w:p>
     <w:p>
       <w:pPr>
+        <w:tabs>
+          <w:tab w:val="right" w:pos="10080"/>
+        </w:tabs>
         <w:spacing w:after="0"/>
         <w:rPr>
           <w:rFonts w:asciiTheme="majorHAnsi" w:hAnsiTheme="majorHAnsi" w:cstheme="majorHAnsi"/>
-          <w:sz w:val="28"/>
-          <w:szCs w:val="28"/>
           <w:lang w:val="de-DE"/>
         </w:rPr>
       </w:pPr>
-      <w:proofErr w:type="spellStart"/>
       <w:r>
         <w:rPr>
           <w:rFonts w:asciiTheme="majorHAnsi" w:hAnsiTheme="majorHAnsi" w:cstheme="majorHAnsi"/>
           <w:b/>
-          <w:sz w:val="24"/>
-          <w:szCs w:val="28"/>
+          <w:sz w:val="20"/>
           <w:lang w:val="de-DE"/>
         </w:rPr>
-        <w:lastRenderedPageBreak/>
-        <w:t>B.Sc</w:t>
-      </w:r>
-      <w:proofErr w:type="spellEnd"/>
-      <w:r>
-        <w:rPr>
-          <w:rFonts w:asciiTheme="majorHAnsi" w:hAnsiTheme="majorHAnsi" w:cstheme="majorHAnsi"/>
-          <w:b/>
-          <w:sz w:val="24"/>
-          <w:szCs w:val="28"/>
-          <w:lang w:val="de-DE"/>
-        </w:rPr>
-        <w:t xml:space="preserve">. Künstliche Intelligenz | </w:t>
-      </w:r>
-      <w:proofErr w:type="spellStart"/>
-      <w:r>
-        <w:rPr>
-          <w:rFonts w:asciiTheme="majorHAnsi" w:hAnsiTheme="majorHAnsi" w:cstheme="majorHAnsi"/>
-          <w:b/>
-          <w:sz w:val="24"/>
-          <w:szCs w:val="28"/>
-          <w:lang w:val="de-DE"/>
-        </w:rPr>
-        <w:t>Arab</w:t>
-      </w:r>
-      <w:proofErr w:type="spellEnd"/>
-      <w:r>
-        <w:rPr>
-          <w:rFonts w:asciiTheme="majorHAnsi" w:hAnsiTheme="majorHAnsi" w:cstheme="majorHAnsi"/>
-          <w:b/>
-          <w:sz w:val="24"/>
-          <w:szCs w:val="28"/>
-          <w:lang w:val="de-DE"/>
-        </w:rPr>
-        <w:t xml:space="preserve"> International University, Damaskus</w:t>
+        <w:t>B.Sc. Künstliche Intelligenz | AIU, Damaskus</w:t>
       </w:r>
       <w:r>
         <w:rPr>
           <w:rFonts w:asciiTheme="majorHAnsi" w:hAnsiTheme="majorHAnsi" w:cstheme="majorHAnsi"/>
           <w:i/>
           <w:color w:val="646464"/>
-          <w:szCs w:val="28"/>
+          <w:sz w:val="18"/>
           <w:lang w:val="de-DE"/>
         </w:rPr>
-        <w:t xml:space="preserve"> | 2012–2017</w:t>
+        <w:tab/>
+        <w:t>2012–2017</w:t>
       </w:r>
     </w:p>
     <w:p>
@@ -1028,39 +741,16 @@
         <w:spacing w:after="20"/>
         <w:rPr>
           <w:rFonts w:asciiTheme="majorHAnsi" w:hAnsiTheme="majorHAnsi" w:cstheme="majorHAnsi"/>
-          <w:sz w:val="28"/>
-          <w:szCs w:val="28"/>
           <w:lang w:val="de-DE"/>
         </w:rPr>
       </w:pPr>
       <w:r>
         <w:rPr>
           <w:rFonts w:asciiTheme="majorHAnsi" w:hAnsiTheme="majorHAnsi" w:cstheme="majorHAnsi"/>
-          <w:sz w:val="24"/>
-          <w:szCs w:val="28"/>
+          <w:sz w:val="20"/>
           <w:lang w:val="de-DE"/>
         </w:rPr>
-        <w:t xml:space="preserve">Relevante Module: Algorithmen, Datenstrukturen, Grundlagen </w:t>
-      </w:r>
-      <w:proofErr w:type="spellStart"/>
-      <w:r>
-        <w:rPr>
-          <w:rFonts w:asciiTheme="majorHAnsi" w:hAnsiTheme="majorHAnsi" w:cstheme="majorHAnsi"/>
-          <w:sz w:val="24"/>
-          <w:szCs w:val="28"/>
-          <w:lang w:val="de-DE"/>
-        </w:rPr>
-        <w:t>Machine</w:t>
-      </w:r>
-      <w:proofErr w:type="spellEnd"/>
-      <w:r>
-        <w:rPr>
-          <w:rFonts w:asciiTheme="majorHAnsi" w:hAnsiTheme="majorHAnsi" w:cstheme="majorHAnsi"/>
-          <w:sz w:val="24"/>
-          <w:szCs w:val="28"/>
-          <w:lang w:val="de-DE"/>
-        </w:rPr>
-        <w:t xml:space="preserve"> Learning.</w:t>
+        <w:t>Relevante Module: Algorithmen, Datenstrukturen, Grundlagen Machine Learning.</w:t>
       </w:r>
     </w:p>
     <w:p>
@@ -1068,8 +758,6 @@
         <w:spacing w:before="120" w:after="40"/>
         <w:rPr>
           <w:rFonts w:asciiTheme="majorHAnsi" w:hAnsiTheme="majorHAnsi" w:cstheme="majorHAnsi"/>
-          <w:sz w:val="28"/>
-          <w:szCs w:val="28"/>
           <w:lang w:val="de-DE"/>
         </w:rPr>
       </w:pPr>
@@ -1078,8 +766,7 @@
           <w:rFonts w:asciiTheme="majorHAnsi" w:hAnsiTheme="majorHAnsi" w:cstheme="majorHAnsi"/>
           <w:b/>
           <w:color w:val="003366"/>
-          <w:sz w:val="32"/>
-          <w:szCs w:val="28"/>
+          <w:sz w:val="24"/>
           <w:lang w:val="de-DE"/>
         </w:rPr>
         <w:t>TECHNISCHE KENNTNISSE</w:t>
@@ -1091,8 +778,6 @@
         <w:ind w:left="288"/>
         <w:rPr>
           <w:rFonts w:asciiTheme="majorHAnsi" w:hAnsiTheme="majorHAnsi" w:cstheme="majorHAnsi"/>
-          <w:sz w:val="28"/>
-          <w:szCs w:val="28"/>
           <w:lang w:val="de-DE"/>
         </w:rPr>
       </w:pPr>
@@ -1100,50 +785,26 @@
         <w:rPr>
           <w:rFonts w:asciiTheme="majorHAnsi" w:hAnsiTheme="majorHAnsi" w:cstheme="majorHAnsi"/>
           <w:b/>
-          <w:sz w:val="24"/>
-          <w:szCs w:val="28"/>
+          <w:sz w:val="20"/>
           <w:lang w:val="de-DE"/>
         </w:rPr>
-        <w:t>• Pro</w:t>
+        <w:t xml:space="preserve">• Programmiersprachen: </w:t>
       </w:r>
       <w:r>
         <w:rPr>
           <w:rFonts w:asciiTheme="majorHAnsi" w:hAnsiTheme="majorHAnsi" w:cstheme="majorHAnsi"/>
-          <w:b/>
-          <w:sz w:val="24"/>
-          <w:szCs w:val="28"/>
+          <w:sz w:val="20"/>
           <w:lang w:val="de-DE"/>
         </w:rPr>
-        <w:t xml:space="preserve">grammiersprachen: </w:t>
+        <w:t>Sehr gut: Java, Kotlin | Gute Kenntnisse: SQL, Java</w:t>
       </w:r>
       <w:r>
         <w:rPr>
           <w:rFonts w:asciiTheme="majorHAnsi" w:hAnsiTheme="majorHAnsi" w:cstheme="majorHAnsi"/>
-          <w:sz w:val="24"/>
-          <w:szCs w:val="28"/>
+          <w:sz w:val="20"/>
           <w:lang w:val="de-DE"/>
         </w:rPr>
-        <w:t xml:space="preserve">Sehr gut: Java, </w:t>
-      </w:r>
-      <w:proofErr w:type="spellStart"/>
-      <w:r>
-        <w:rPr>
-          <w:rFonts w:asciiTheme="majorHAnsi" w:hAnsiTheme="majorHAnsi" w:cstheme="majorHAnsi"/>
-          <w:sz w:val="24"/>
-          <w:szCs w:val="28"/>
-          <w:lang w:val="de-DE"/>
-        </w:rPr>
-        <w:t>Kotlin</w:t>
-      </w:r>
-      <w:proofErr w:type="spellEnd"/>
-      <w:r>
-        <w:rPr>
-          <w:rFonts w:asciiTheme="majorHAnsi" w:hAnsiTheme="majorHAnsi" w:cstheme="majorHAnsi"/>
-          <w:sz w:val="24"/>
-          <w:szCs w:val="28"/>
-          <w:lang w:val="de-DE"/>
-        </w:rPr>
-        <w:t xml:space="preserve"> | Gute Kenntnisse: SQL, JavaScript | Grundkenntnisse: Python, C#, Spring Boot (in Ausbildung)</w:t>
+        <w:t>Script | Grundkenntnisse: Python, C#, Spring Boot (in Ausbildung)</w:t>
       </w:r>
     </w:p>
     <w:p>
@@ -1152,8 +813,6 @@
         <w:ind w:left="288"/>
         <w:rPr>
           <w:rFonts w:asciiTheme="majorHAnsi" w:hAnsiTheme="majorHAnsi" w:cstheme="majorHAnsi"/>
-          <w:sz w:val="28"/>
-          <w:szCs w:val="28"/>
           <w:lang w:val="de-DE"/>
         </w:rPr>
       </w:pPr>
@@ -1161,8 +820,7 @@
         <w:rPr>
           <w:rFonts w:asciiTheme="majorHAnsi" w:hAnsiTheme="majorHAnsi" w:cstheme="majorHAnsi"/>
           <w:b/>
-          <w:sz w:val="24"/>
-          <w:szCs w:val="28"/>
+          <w:sz w:val="20"/>
           <w:lang w:val="de-DE"/>
         </w:rPr>
         <w:t xml:space="preserve">• Android-Entwicklung: </w:t>
@@ -1170,51 +828,10 @@
       <w:r>
         <w:rPr>
           <w:rFonts w:asciiTheme="majorHAnsi" w:hAnsiTheme="majorHAnsi" w:cstheme="majorHAnsi"/>
-          <w:sz w:val="24"/>
-          <w:szCs w:val="28"/>
+          <w:sz w:val="20"/>
           <w:lang w:val="de-DE"/>
         </w:rPr>
-        <w:t xml:space="preserve">Android SDK, MVVM, MVP, </w:t>
-      </w:r>
-      <w:proofErr w:type="spellStart"/>
-      <w:r>
-        <w:rPr>
-          <w:rFonts w:asciiTheme="majorHAnsi" w:hAnsiTheme="majorHAnsi" w:cstheme="majorHAnsi"/>
-          <w:sz w:val="24"/>
-          <w:szCs w:val="28"/>
-          <w:lang w:val="de-DE"/>
-        </w:rPr>
-        <w:t>Firebase</w:t>
-      </w:r>
-      <w:proofErr w:type="spellEnd"/>
-      <w:r>
-        <w:rPr>
-          <w:rFonts w:asciiTheme="majorHAnsi" w:hAnsiTheme="majorHAnsi" w:cstheme="majorHAnsi"/>
-          <w:sz w:val="24"/>
-          <w:szCs w:val="28"/>
-          <w:lang w:val="de-DE"/>
-        </w:rPr>
-        <w:t xml:space="preserve">, Android Studio, </w:t>
-      </w:r>
-      <w:proofErr w:type="spellStart"/>
-      <w:r>
-        <w:rPr>
-          <w:rFonts w:asciiTheme="majorHAnsi" w:hAnsiTheme="majorHAnsi" w:cstheme="majorHAnsi"/>
-          <w:sz w:val="24"/>
-          <w:szCs w:val="28"/>
-          <w:lang w:val="de-DE"/>
-        </w:rPr>
-        <w:t>Jetpack</w:t>
-      </w:r>
-      <w:proofErr w:type="spellEnd"/>
-      <w:r>
-        <w:rPr>
-          <w:rFonts w:asciiTheme="majorHAnsi" w:hAnsiTheme="majorHAnsi" w:cstheme="majorHAnsi"/>
-          <w:sz w:val="24"/>
-          <w:szCs w:val="28"/>
-          <w:lang w:val="de-DE"/>
-        </w:rPr>
-        <w:t xml:space="preserve"> Components</w:t>
+        <w:t>Android SDK, MVVM, MVP, Firebase, Android Studio, Jetpack Components</w:t>
       </w:r>
     </w:p>
     <w:p>
@@ -1223,8 +840,6 @@
         <w:ind w:left="288"/>
         <w:rPr>
           <w:rFonts w:asciiTheme="majorHAnsi" w:hAnsiTheme="majorHAnsi" w:cstheme="majorHAnsi"/>
-          <w:sz w:val="28"/>
-          <w:szCs w:val="28"/>
           <w:lang w:val="de-DE"/>
         </w:rPr>
       </w:pPr>
@@ -1232,8 +847,7 @@
         <w:rPr>
           <w:rFonts w:asciiTheme="majorHAnsi" w:hAnsiTheme="majorHAnsi" w:cstheme="majorHAnsi"/>
           <w:b/>
-          <w:sz w:val="24"/>
-          <w:szCs w:val="28"/>
+          <w:sz w:val="20"/>
           <w:lang w:val="de-DE"/>
         </w:rPr>
         <w:t xml:space="preserve">• Backend &amp; APIs: </w:t>
@@ -1241,20 +855,10 @@
       <w:r>
         <w:rPr>
           <w:rFonts w:asciiTheme="majorHAnsi" w:hAnsiTheme="majorHAnsi" w:cstheme="majorHAnsi"/>
-          <w:sz w:val="24"/>
-          <w:szCs w:val="28"/>
+          <w:sz w:val="20"/>
           <w:lang w:val="de-DE"/>
         </w:rPr>
-        <w:t>REST API De</w:t>
-      </w:r>
-      <w:r>
-        <w:rPr>
-          <w:rFonts w:asciiTheme="majorHAnsi" w:hAnsiTheme="majorHAnsi" w:cstheme="majorHAnsi"/>
-          <w:sz w:val="24"/>
-          <w:szCs w:val="28"/>
-          <w:lang w:val="de-DE"/>
-        </w:rPr>
-        <w:t>sign, JSON, HTTP, Grundlagen Backend-Entwicklung</w:t>
+        <w:t>REST API Design, JSON, HTTP, Grundlagen Backend-Entwicklung</w:t>
       </w:r>
     </w:p>
     <w:p>
@@ -1263,8 +867,6 @@
         <w:ind w:left="288"/>
         <w:rPr>
           <w:rFonts w:asciiTheme="majorHAnsi" w:hAnsiTheme="majorHAnsi" w:cstheme="majorHAnsi"/>
-          <w:sz w:val="28"/>
-          <w:szCs w:val="28"/>
           <w:lang w:val="de-DE"/>
         </w:rPr>
       </w:pPr>
@@ -1272,91 +874,18 @@
         <w:rPr>
           <w:rFonts w:asciiTheme="majorHAnsi" w:hAnsiTheme="majorHAnsi" w:cstheme="majorHAnsi"/>
           <w:b/>
-          <w:sz w:val="24"/>
-          <w:szCs w:val="28"/>
+          <w:sz w:val="20"/>
           <w:lang w:val="de-DE"/>
         </w:rPr>
         <w:t xml:space="preserve">• Tools &amp; Methoden: </w:t>
       </w:r>
-      <w:proofErr w:type="spellStart"/>
       <w:r>
         <w:rPr>
           <w:rFonts w:asciiTheme="majorHAnsi" w:hAnsiTheme="majorHAnsi" w:cstheme="majorHAnsi"/>
-          <w:sz w:val="24"/>
-          <w:szCs w:val="28"/>
+          <w:sz w:val="20"/>
           <w:lang w:val="de-DE"/>
         </w:rPr>
-        <w:t>Git</w:t>
-      </w:r>
-      <w:proofErr w:type="spellEnd"/>
-      <w:r>
-        <w:rPr>
-          <w:rFonts w:asciiTheme="majorHAnsi" w:hAnsiTheme="majorHAnsi" w:cstheme="majorHAnsi"/>
-          <w:sz w:val="24"/>
-          <w:szCs w:val="28"/>
-          <w:lang w:val="de-DE"/>
-        </w:rPr>
-        <w:t>, CI/CD (</w:t>
-      </w:r>
-      <w:proofErr w:type="spellStart"/>
-      <w:r>
-        <w:rPr>
-          <w:rFonts w:asciiTheme="majorHAnsi" w:hAnsiTheme="majorHAnsi" w:cstheme="majorHAnsi"/>
-          <w:sz w:val="24"/>
-          <w:szCs w:val="28"/>
-          <w:lang w:val="de-DE"/>
-        </w:rPr>
-        <w:t>GitLab</w:t>
-      </w:r>
-      <w:proofErr w:type="spellEnd"/>
-      <w:r>
-        <w:rPr>
-          <w:rFonts w:asciiTheme="majorHAnsi" w:hAnsiTheme="majorHAnsi" w:cstheme="majorHAnsi"/>
-          <w:sz w:val="24"/>
-          <w:szCs w:val="28"/>
-          <w:lang w:val="de-DE"/>
-        </w:rPr>
-        <w:t xml:space="preserve"> CI), Agile/</w:t>
-      </w:r>
-      <w:proofErr w:type="spellStart"/>
-      <w:r>
-        <w:rPr>
-          <w:rFonts w:asciiTheme="majorHAnsi" w:hAnsiTheme="majorHAnsi" w:cstheme="majorHAnsi"/>
-          <w:sz w:val="24"/>
-          <w:szCs w:val="28"/>
-          <w:lang w:val="de-DE"/>
-        </w:rPr>
-        <w:t>Scrum</w:t>
-      </w:r>
-      <w:proofErr w:type="spellEnd"/>
-      <w:r>
-        <w:rPr>
-          <w:rFonts w:asciiTheme="majorHAnsi" w:hAnsiTheme="majorHAnsi" w:cstheme="majorHAnsi"/>
-          <w:sz w:val="24"/>
-          <w:szCs w:val="28"/>
-          <w:lang w:val="de-DE"/>
-        </w:rPr>
-        <w:t xml:space="preserve">, Clean Code, Unit </w:t>
-      </w:r>
-      <w:proofErr w:type="spellStart"/>
-      <w:r>
-        <w:rPr>
-          <w:rFonts w:asciiTheme="majorHAnsi" w:hAnsiTheme="majorHAnsi" w:cstheme="majorHAnsi"/>
-          <w:sz w:val="24"/>
-          <w:szCs w:val="28"/>
-          <w:lang w:val="de-DE"/>
-        </w:rPr>
-        <w:t>Testing</w:t>
-      </w:r>
-      <w:proofErr w:type="spellEnd"/>
-      <w:r>
-        <w:rPr>
-          <w:rFonts w:asciiTheme="majorHAnsi" w:hAnsiTheme="majorHAnsi" w:cstheme="majorHAnsi"/>
-          <w:sz w:val="24"/>
-          <w:szCs w:val="28"/>
-          <w:lang w:val="de-DE"/>
-        </w:rPr>
-        <w:t xml:space="preserve"> (Grundlagen)</w:t>
+        <w:t>Git, CI/CD (GitLab CI), Agile/Scrum, Clean Code, Unit Testing (Grundlagen)</w:t>
       </w:r>
     </w:p>
     <w:p>
@@ -1365,8 +894,6 @@
         <w:ind w:left="288"/>
         <w:rPr>
           <w:rFonts w:asciiTheme="majorHAnsi" w:hAnsiTheme="majorHAnsi" w:cstheme="majorHAnsi"/>
-          <w:sz w:val="28"/>
-          <w:szCs w:val="28"/>
           <w:lang w:val="de-DE"/>
         </w:rPr>
       </w:pPr>
@@ -1374,8 +901,7 @@
         <w:rPr>
           <w:rFonts w:asciiTheme="majorHAnsi" w:hAnsiTheme="majorHAnsi" w:cstheme="majorHAnsi"/>
           <w:b/>
-          <w:sz w:val="24"/>
-          <w:szCs w:val="28"/>
+          <w:sz w:val="20"/>
           <w:lang w:val="de-DE"/>
         </w:rPr>
         <w:t xml:space="preserve">• Web &amp; Sonstiges: </w:t>
@@ -1383,51 +909,17 @@
       <w:r>
         <w:rPr>
           <w:rFonts w:asciiTheme="majorHAnsi" w:hAnsiTheme="majorHAnsi" w:cstheme="majorHAnsi"/>
-          <w:sz w:val="24"/>
-          <w:szCs w:val="28"/>
+          <w:sz w:val="20"/>
           <w:lang w:val="de-DE"/>
         </w:rPr>
-        <w:t xml:space="preserve">HTML5, CSS3, </w:t>
+        <w:t>HTML5, CSS3, Responsive Design, Grundkenntnisse Unity</w:t>
       </w:r>
-      <w:proofErr w:type="spellStart"/>
-      <w:r>
-        <w:rPr>
-          <w:rFonts w:asciiTheme="majorHAnsi" w:hAnsiTheme="majorHAnsi" w:cstheme="majorHAnsi"/>
-          <w:sz w:val="24"/>
-          <w:szCs w:val="28"/>
-          <w:lang w:val="de-DE"/>
-        </w:rPr>
-        <w:t>Responsive</w:t>
-      </w:r>
-      <w:proofErr w:type="spellEnd"/>
-      <w:r>
-        <w:rPr>
-          <w:rFonts w:asciiTheme="majorHAnsi" w:hAnsiTheme="majorHAnsi" w:cstheme="majorHAnsi"/>
-          <w:sz w:val="24"/>
-          <w:szCs w:val="28"/>
-          <w:lang w:val="de-DE"/>
-        </w:rPr>
-        <w:t xml:space="preserve"> Design, Grundkenntnisse </w:t>
-      </w:r>
-      <w:proofErr w:type="spellStart"/>
-      <w:r>
-        <w:rPr>
-          <w:rFonts w:asciiTheme="majorHAnsi" w:hAnsiTheme="majorHAnsi" w:cstheme="majorHAnsi"/>
-          <w:sz w:val="24"/>
-          <w:szCs w:val="28"/>
-          <w:lang w:val="de-DE"/>
-        </w:rPr>
-        <w:t>Unity</w:t>
-      </w:r>
-      <w:proofErr w:type="spellEnd"/>
     </w:p>
     <w:p>
       <w:pPr>
         <w:spacing w:before="120" w:after="40"/>
         <w:rPr>
           <w:rFonts w:asciiTheme="majorHAnsi" w:hAnsiTheme="majorHAnsi" w:cstheme="majorHAnsi"/>
-          <w:sz w:val="28"/>
-          <w:szCs w:val="28"/>
           <w:lang w:val="de-DE"/>
         </w:rPr>
       </w:pPr>
@@ -1436,8 +928,7 @@
           <w:rFonts w:asciiTheme="majorHAnsi" w:hAnsiTheme="majorHAnsi" w:cstheme="majorHAnsi"/>
           <w:b/>
           <w:color w:val="003366"/>
-          <w:sz w:val="32"/>
-          <w:szCs w:val="28"/>
+          <w:sz w:val="24"/>
           <w:lang w:val="de-DE"/>
         </w:rPr>
         <w:t>PROJEKTE (AUSWAHL)</w:t>
@@ -1448,119 +939,56 @@
         <w:spacing w:after="0"/>
         <w:rPr>
           <w:rFonts w:asciiTheme="majorHAnsi" w:hAnsiTheme="majorHAnsi" w:cstheme="majorHAnsi"/>
-          <w:sz w:val="28"/>
-          <w:szCs w:val="28"/>
           <w:lang w:val="de-DE"/>
         </w:rPr>
       </w:pPr>
-      <w:proofErr w:type="spellStart"/>
       <w:r>
         <w:rPr>
           <w:rFonts w:asciiTheme="majorHAnsi" w:hAnsiTheme="majorHAnsi" w:cstheme="majorHAnsi"/>
           <w:b/>
-          <w:sz w:val="24"/>
-          <w:szCs w:val="28"/>
+          <w:sz w:val="20"/>
           <w:lang w:val="de-DE"/>
         </w:rPr>
-        <w:t>Tarasol</w:t>
-      </w:r>
-      <w:proofErr w:type="spellEnd"/>
-      <w:r>
-        <w:rPr>
-          <w:rFonts w:asciiTheme="majorHAnsi" w:hAnsiTheme="majorHAnsi" w:cstheme="majorHAnsi"/>
-          <w:b/>
-          <w:sz w:val="24"/>
-          <w:szCs w:val="28"/>
-          <w:lang w:val="de-DE"/>
-        </w:rPr>
-        <w:t xml:space="preserve"> – Enterprise</w:t>
-      </w:r>
-      <w:r>
-        <w:rPr>
-          <w:rFonts w:asciiTheme="majorHAnsi" w:hAnsiTheme="majorHAnsi" w:cstheme="majorHAnsi"/>
-          <w:b/>
-          <w:sz w:val="24"/>
-          <w:szCs w:val="28"/>
-          <w:lang w:val="de-DE"/>
-        </w:rPr>
-        <w:t xml:space="preserve"> </w:t>
-      </w:r>
-      <w:proofErr w:type="spellStart"/>
-      <w:r>
-        <w:rPr>
-          <w:rFonts w:asciiTheme="majorHAnsi" w:hAnsiTheme="majorHAnsi" w:cstheme="majorHAnsi"/>
-          <w:b/>
-          <w:sz w:val="24"/>
-          <w:szCs w:val="28"/>
-          <w:lang w:val="de-DE"/>
-        </w:rPr>
-        <w:t>Document</w:t>
-      </w:r>
-      <w:proofErr w:type="spellEnd"/>
-      <w:r>
-        <w:rPr>
-          <w:rFonts w:asciiTheme="majorHAnsi" w:hAnsiTheme="majorHAnsi" w:cstheme="majorHAnsi"/>
-          <w:b/>
-          <w:sz w:val="24"/>
-          <w:szCs w:val="28"/>
-          <w:lang w:val="de-DE"/>
-        </w:rPr>
-        <w:t xml:space="preserve"> Management (2022)</w:t>
+        <w:lastRenderedPageBreak/>
+        <w:t>Tarasol – Enterprise Document Management (2022)</w:t>
       </w:r>
     </w:p>
     <w:p>
       <w:pPr>
         <w:pStyle w:val="Aufzhlungszeichen"/>
-        <w:spacing w:after="20"/>
-        <w:rPr>
-          <w:rFonts w:asciiTheme="majorHAnsi" w:hAnsiTheme="majorHAnsi" w:cstheme="majorHAnsi"/>
-          <w:sz w:val="28"/>
-          <w:szCs w:val="28"/>
+        <w:spacing w:after="0"/>
+        <w:rPr>
+          <w:rFonts w:asciiTheme="majorHAnsi" w:hAnsiTheme="majorHAnsi" w:cstheme="majorHAnsi"/>
         </w:rPr>
       </w:pPr>
       <w:r>
         <w:rPr>
           <w:rFonts w:asciiTheme="majorHAnsi" w:hAnsiTheme="majorHAnsi" w:cstheme="majorHAnsi"/>
-          <w:sz w:val="24"/>
-          <w:szCs w:val="28"/>
-        </w:rPr>
-        <w:t xml:space="preserve">Tech: Java, </w:t>
+          <w:sz w:val="20"/>
+        </w:rPr>
+        <w:t xml:space="preserve">Tech: Java, Kotlin, Android SDK, REST </w:t>
       </w:r>
-      <w:proofErr w:type="spellStart"/>
       <w:r>
         <w:rPr>
           <w:rFonts w:asciiTheme="majorHAnsi" w:hAnsiTheme="majorHAnsi" w:cstheme="majorHAnsi"/>
-          <w:sz w:val="24"/>
-          <w:szCs w:val="28"/>
-        </w:rPr>
-        <w:t>Kotlin</w:t>
-      </w:r>
-      <w:proofErr w:type="spellEnd"/>
-      <w:r>
-        <w:rPr>
-          <w:rFonts w:asciiTheme="majorHAnsi" w:hAnsiTheme="majorHAnsi" w:cstheme="majorHAnsi"/>
-          <w:sz w:val="24"/>
-          <w:szCs w:val="28"/>
-        </w:rPr>
-        <w:t>, Android SDK, REST API, SQLite, MVVM</w:t>
+          <w:sz w:val="20"/>
+        </w:rPr>
+        <w:t>API, SQLite, MVVM</w:t>
       </w:r>
     </w:p>
     <w:p>
       <w:pPr>
         <w:pStyle w:val="Aufzhlungszeichen"/>
-        <w:spacing w:after="20"/>
-        <w:rPr>
-          <w:rFonts w:asciiTheme="majorHAnsi" w:hAnsiTheme="majorHAnsi" w:cstheme="majorHAnsi"/>
-          <w:sz w:val="28"/>
-          <w:szCs w:val="28"/>
+        <w:spacing w:after="0"/>
+        <w:rPr>
+          <w:rFonts w:asciiTheme="majorHAnsi" w:hAnsiTheme="majorHAnsi" w:cstheme="majorHAnsi"/>
           <w:lang w:val="de-DE"/>
         </w:rPr>
       </w:pPr>
       <w:r>
         <w:rPr>
           <w:rFonts w:asciiTheme="majorHAnsi" w:hAnsiTheme="majorHAnsi" w:cstheme="majorHAnsi"/>
-          <w:sz w:val="24"/>
-          <w:szCs w:val="28"/>
+          <w:sz w:val="20"/>
           <w:lang w:val="de-DE"/>
         </w:rPr>
         <w:t>Rolle: Android-Entwicklung mit Fokus auf Offline-Fähigkeit, Push-Benachrichtigungen und Task-Management.</w:t>
@@ -1569,78 +997,66 @@
     <w:p>
       <w:pPr>
         <w:pStyle w:val="Aufzhlungszeichen"/>
-        <w:spacing w:after="20"/>
-        <w:rPr>
-          <w:rFonts w:asciiTheme="majorHAnsi" w:hAnsiTheme="majorHAnsi" w:cstheme="majorHAnsi"/>
-          <w:sz w:val="28"/>
-          <w:szCs w:val="28"/>
+        <w:spacing w:after="0"/>
+        <w:rPr>
+          <w:rFonts w:asciiTheme="majorHAnsi" w:hAnsiTheme="majorHAnsi" w:cstheme="majorHAnsi"/>
           <w:lang w:val="de-DE"/>
         </w:rPr>
       </w:pPr>
       <w:r>
         <w:rPr>
           <w:rFonts w:asciiTheme="majorHAnsi" w:hAnsiTheme="majorHAnsi" w:cstheme="majorHAnsi"/>
-          <w:sz w:val="24"/>
-          <w:szCs w:val="28"/>
+          <w:sz w:val="20"/>
           <w:lang w:val="de-DE"/>
         </w:rPr>
-        <w:t xml:space="preserve">Ergebnis: Unterstützung papierloser Workflows für aktive Nutzer im </w:t>
-      </w:r>
-      <w:r>
-        <w:rPr>
-          <w:rFonts w:asciiTheme="majorHAnsi" w:hAnsiTheme="majorHAnsi" w:cstheme="majorHAnsi"/>
-          <w:sz w:val="24"/>
-          <w:szCs w:val="28"/>
-          <w:lang w:val="de-DE"/>
-        </w:rPr>
-        <w:t>Unternehmensumfeld.</w:t>
+        <w:t>Ergebnis: Unterstützung papierloser Workflows für aktive Nutzer im Unternehmensumfeld.</w:t>
       </w:r>
     </w:p>
     <w:p>
       <w:pPr>
+        <w:spacing w:after="40"/>
+        <w:rPr>
+          <w:rFonts w:asciiTheme="majorHAnsi" w:hAnsiTheme="majorHAnsi" w:cstheme="majorHAnsi"/>
+          <w:lang w:val="de-DE"/>
+        </w:rPr>
+      </w:pPr>
+    </w:p>
+    <w:p>
+      <w:pPr>
         <w:spacing w:after="0"/>
         <w:rPr>
           <w:rFonts w:asciiTheme="majorHAnsi" w:hAnsiTheme="majorHAnsi" w:cstheme="majorHAnsi"/>
-          <w:sz w:val="28"/>
-          <w:szCs w:val="28"/>
-        </w:rPr>
-      </w:pPr>
-      <w:proofErr w:type="spellStart"/>
+        </w:rPr>
+      </w:pPr>
       <w:r>
         <w:rPr>
           <w:rFonts w:asciiTheme="majorHAnsi" w:hAnsiTheme="majorHAnsi" w:cstheme="majorHAnsi"/>
           <w:b/>
-          <w:sz w:val="24"/>
-          <w:szCs w:val="28"/>
-        </w:rPr>
-        <w:t>Arcmate</w:t>
+          <w:sz w:val="20"/>
+        </w:rPr>
+        <w:t>Arcmate 9 – Enterprise Repository Client (202</w:t>
       </w:r>
-      <w:proofErr w:type="spellEnd"/>
       <w:r>
         <w:rPr>
           <w:rFonts w:asciiTheme="majorHAnsi" w:hAnsiTheme="majorHAnsi" w:cstheme="majorHAnsi"/>
           <w:b/>
-          <w:sz w:val="24"/>
-          <w:szCs w:val="28"/>
-        </w:rPr>
-        <w:t xml:space="preserve"> 9 – Enterprise Repository Client (2021)</w:t>
+          <w:sz w:val="20"/>
+        </w:rPr>
+        <w:t>1)</w:t>
       </w:r>
     </w:p>
     <w:p>
       <w:pPr>
         <w:pStyle w:val="Aufzhlungszeichen"/>
-        <w:spacing w:after="20"/>
-        <w:rPr>
-          <w:rFonts w:asciiTheme="majorHAnsi" w:hAnsiTheme="majorHAnsi" w:cstheme="majorHAnsi"/>
-          <w:sz w:val="28"/>
-          <w:szCs w:val="28"/>
+        <w:spacing w:after="0"/>
+        <w:rPr>
+          <w:rFonts w:asciiTheme="majorHAnsi" w:hAnsiTheme="majorHAnsi" w:cstheme="majorHAnsi"/>
         </w:rPr>
       </w:pPr>
       <w:r>
         <w:rPr>
           <w:rFonts w:asciiTheme="majorHAnsi" w:hAnsiTheme="majorHAnsi" w:cstheme="majorHAnsi"/>
-          <w:sz w:val="24"/>
-          <w:szCs w:val="28"/>
+          <w:sz w:val="20"/>
         </w:rPr>
         <w:t>Tech: Java, Android SDK, Enterprise Integration, REST API</w:t>
       </w:r>
@@ -1648,159 +1064,84 @@
     <w:p>
       <w:pPr>
         <w:pStyle w:val="Aufzhlungszeichen"/>
-        <w:spacing w:after="20"/>
-        <w:rPr>
-          <w:rFonts w:asciiTheme="majorHAnsi" w:hAnsiTheme="majorHAnsi" w:cstheme="majorHAnsi"/>
-          <w:sz w:val="28"/>
-          <w:szCs w:val="28"/>
+        <w:spacing w:after="0"/>
+        <w:rPr>
+          <w:rFonts w:asciiTheme="majorHAnsi" w:hAnsiTheme="majorHAnsi" w:cstheme="majorHAnsi"/>
           <w:lang w:val="de-DE"/>
         </w:rPr>
       </w:pPr>
       <w:r>
         <w:rPr>
           <w:rFonts w:asciiTheme="majorHAnsi" w:hAnsiTheme="majorHAnsi" w:cstheme="majorHAnsi"/>
-          <w:sz w:val="24"/>
-          <w:szCs w:val="28"/>
+          <w:sz w:val="20"/>
           <w:lang w:val="de-DE"/>
         </w:rPr>
-        <w:t>Rolle: Implementierung der Suchfunktion und Offline-</w:t>
-      </w:r>
-      <w:proofErr w:type="spellStart"/>
-      <w:r>
-        <w:rPr>
-          <w:rFonts w:asciiTheme="majorHAnsi" w:hAnsiTheme="majorHAnsi" w:cstheme="majorHAnsi"/>
-          <w:sz w:val="24"/>
-          <w:szCs w:val="28"/>
-          <w:lang w:val="de-DE"/>
-        </w:rPr>
-        <w:t>Sync</w:t>
-      </w:r>
-      <w:proofErr w:type="spellEnd"/>
-      <w:r>
-        <w:rPr>
-          <w:rFonts w:asciiTheme="majorHAnsi" w:hAnsiTheme="majorHAnsi" w:cstheme="majorHAnsi"/>
-          <w:sz w:val="24"/>
-          <w:szCs w:val="28"/>
-          <w:lang w:val="de-DE"/>
-        </w:rPr>
-        <w:t xml:space="preserve"> für Dokumenten-</w:t>
-      </w:r>
-      <w:proofErr w:type="spellStart"/>
-      <w:r>
-        <w:rPr>
-          <w:rFonts w:asciiTheme="majorHAnsi" w:hAnsiTheme="majorHAnsi" w:cstheme="majorHAnsi"/>
-          <w:sz w:val="24"/>
-          <w:szCs w:val="28"/>
-          <w:lang w:val="de-DE"/>
-        </w:rPr>
-        <w:t>Repositories</w:t>
-      </w:r>
-      <w:proofErr w:type="spellEnd"/>
-      <w:r>
-        <w:rPr>
-          <w:rFonts w:asciiTheme="majorHAnsi" w:hAnsiTheme="majorHAnsi" w:cstheme="majorHAnsi"/>
-          <w:sz w:val="24"/>
-          <w:szCs w:val="28"/>
-          <w:lang w:val="de-DE"/>
-        </w:rPr>
-        <w:t>.</w:t>
+        <w:t>Rolle: Implementierung der Suchfunktion und Offline-Sync für Dokumenten-Repositories.</w:t>
       </w:r>
     </w:p>
     <w:p>
       <w:pPr>
         <w:pStyle w:val="Aufzhlungszeichen"/>
-        <w:spacing w:after="20"/>
-        <w:rPr>
-          <w:rFonts w:asciiTheme="majorHAnsi" w:hAnsiTheme="majorHAnsi" w:cstheme="majorHAnsi"/>
-          <w:sz w:val="28"/>
-          <w:szCs w:val="28"/>
+        <w:spacing w:after="0"/>
+        <w:rPr>
+          <w:rFonts w:asciiTheme="majorHAnsi" w:hAnsiTheme="majorHAnsi" w:cstheme="majorHAnsi"/>
           <w:lang w:val="de-DE"/>
         </w:rPr>
       </w:pPr>
       <w:r>
         <w:rPr>
           <w:rFonts w:asciiTheme="majorHAnsi" w:hAnsiTheme="majorHAnsi" w:cstheme="majorHAnsi"/>
-          <w:sz w:val="24"/>
-          <w:szCs w:val="28"/>
+          <w:sz w:val="20"/>
           <w:lang w:val="de-DE"/>
         </w:rPr>
-        <w:t>Ergebnis: Nahtlose Integration in bestehende</w:t>
-      </w:r>
-      <w:r>
-        <w:rPr>
-          <w:rFonts w:asciiTheme="majorHAnsi" w:hAnsiTheme="majorHAnsi" w:cstheme="majorHAnsi"/>
-          <w:sz w:val="24"/>
-          <w:szCs w:val="28"/>
-          <w:lang w:val="de-DE"/>
-        </w:rPr>
-        <w:t xml:space="preserve"> Enterprise-Infrastruktur.</w:t>
+        <w:t>Ergebnis: Nahtlose Integration in bestehende Enterprise-Infrastruktur.</w:t>
       </w:r>
     </w:p>
     <w:p>
       <w:pPr>
+        <w:spacing w:after="40"/>
+        <w:rPr>
+          <w:rFonts w:asciiTheme="majorHAnsi" w:hAnsiTheme="majorHAnsi" w:cstheme="majorHAnsi"/>
+          <w:lang w:val="de-DE"/>
+        </w:rPr>
+      </w:pPr>
+    </w:p>
+    <w:p>
+      <w:pPr>
         <w:spacing w:after="0"/>
         <w:rPr>
           <w:rFonts w:asciiTheme="majorHAnsi" w:hAnsiTheme="majorHAnsi" w:cstheme="majorHAnsi"/>
-          <w:sz w:val="28"/>
-          <w:szCs w:val="28"/>
-        </w:rPr>
-      </w:pPr>
-      <w:proofErr w:type="spellStart"/>
+        </w:rPr>
+      </w:pPr>
       <w:r>
         <w:rPr>
           <w:rFonts w:asciiTheme="majorHAnsi" w:hAnsiTheme="majorHAnsi" w:cstheme="majorHAnsi"/>
           <w:b/>
-          <w:sz w:val="24"/>
-          <w:szCs w:val="28"/>
-        </w:rPr>
-        <w:t>Fliesen</w:t>
+          <w:sz w:val="20"/>
+        </w:rPr>
+        <w:t xml:space="preserve">Fliesen Demirel – Responsive Website </w:t>
       </w:r>
-      <w:proofErr w:type="spellEnd"/>
       <w:r>
         <w:rPr>
           <w:rFonts w:asciiTheme="majorHAnsi" w:hAnsiTheme="majorHAnsi" w:cstheme="majorHAnsi"/>
           <w:b/>
-          <w:sz w:val="24"/>
-          <w:szCs w:val="28"/>
-        </w:rPr>
-        <w:t xml:space="preserve"> </w:t>
-      </w:r>
-      <w:proofErr w:type="spellStart"/>
-      <w:r>
-        <w:rPr>
-          <w:rFonts w:asciiTheme="majorHAnsi" w:hAnsiTheme="majorHAnsi" w:cstheme="majorHAnsi"/>
-          <w:b/>
-          <w:sz w:val="24"/>
-          <w:szCs w:val="28"/>
-        </w:rPr>
-        <w:t>Demirel</w:t>
-      </w:r>
-      <w:proofErr w:type="spellEnd"/>
-      <w:r>
-        <w:rPr>
-          <w:rFonts w:asciiTheme="majorHAnsi" w:hAnsiTheme="majorHAnsi" w:cstheme="majorHAnsi"/>
-          <w:b/>
-          <w:sz w:val="24"/>
-          <w:szCs w:val="28"/>
-        </w:rPr>
-        <w:t xml:space="preserve"> – Responsive Website (2025)</w:t>
+          <w:sz w:val="20"/>
+        </w:rPr>
+        <w:t>(2025)</w:t>
       </w:r>
     </w:p>
     <w:p>
       <w:pPr>
         <w:pStyle w:val="Aufzhlungszeichen"/>
-        <w:spacing w:after="20"/>
-        <w:rPr>
-          <w:rFonts w:asciiTheme="majorHAnsi" w:hAnsiTheme="majorHAnsi" w:cstheme="majorHAnsi"/>
-          <w:sz w:val="28"/>
-          <w:szCs w:val="28"/>
+        <w:spacing w:after="0"/>
+        <w:rPr>
+          <w:rFonts w:asciiTheme="majorHAnsi" w:hAnsiTheme="majorHAnsi" w:cstheme="majorHAnsi"/>
         </w:rPr>
       </w:pPr>
       <w:r>
         <w:rPr>
           <w:rFonts w:asciiTheme="majorHAnsi" w:hAnsiTheme="majorHAnsi" w:cstheme="majorHAnsi"/>
-          <w:sz w:val="24"/>
-          <w:szCs w:val="28"/>
+          <w:sz w:val="20"/>
         </w:rPr>
         <w:t>Tech: HTML, CSS, JavaScript, Responsive Web Design</w:t>
       </w:r>
@@ -1808,19 +1149,16 @@
     <w:p>
       <w:pPr>
         <w:pStyle w:val="Aufzhlungszeichen"/>
-        <w:spacing w:after="20"/>
-        <w:rPr>
-          <w:rFonts w:asciiTheme="majorHAnsi" w:hAnsiTheme="majorHAnsi" w:cstheme="majorHAnsi"/>
-          <w:sz w:val="28"/>
-          <w:szCs w:val="28"/>
+        <w:spacing w:after="0"/>
+        <w:rPr>
+          <w:rFonts w:asciiTheme="majorHAnsi" w:hAnsiTheme="majorHAnsi" w:cstheme="majorHAnsi"/>
           <w:lang w:val="de-DE"/>
         </w:rPr>
       </w:pPr>
       <w:r>
         <w:rPr>
           <w:rFonts w:asciiTheme="majorHAnsi" w:hAnsiTheme="majorHAnsi" w:cstheme="majorHAnsi"/>
-          <w:sz w:val="24"/>
-          <w:szCs w:val="28"/>
+          <w:sz w:val="20"/>
           <w:lang w:val="de-DE"/>
         </w:rPr>
         <w:t>Rolle: Umsetzung eines benutzerfreundlichen Designs für Desktop, Tablet und Mobile.</w:t>
@@ -1829,67 +1167,66 @@
     <w:p>
       <w:pPr>
         <w:pStyle w:val="Aufzhlungszeichen"/>
-        <w:spacing w:after="20"/>
-        <w:rPr>
-          <w:rFonts w:asciiTheme="majorHAnsi" w:hAnsiTheme="majorHAnsi" w:cstheme="majorHAnsi"/>
-          <w:sz w:val="28"/>
-          <w:szCs w:val="28"/>
+        <w:spacing w:after="0"/>
+        <w:rPr>
+          <w:rFonts w:asciiTheme="majorHAnsi" w:hAnsiTheme="majorHAnsi" w:cstheme="majorHAnsi"/>
           <w:lang w:val="de-DE"/>
         </w:rPr>
       </w:pPr>
       <w:r>
         <w:rPr>
           <w:rFonts w:asciiTheme="majorHAnsi" w:hAnsiTheme="majorHAnsi" w:cstheme="majorHAnsi"/>
-          <w:sz w:val="24"/>
-          <w:szCs w:val="28"/>
+          <w:sz w:val="20"/>
           <w:lang w:val="de-DE"/>
         </w:rPr>
-        <w:t xml:space="preserve">Ergebnis: Professionelle Webpräsenz zur </w:t>
-      </w:r>
-      <w:r>
-        <w:rPr>
-          <w:rFonts w:asciiTheme="majorHAnsi" w:hAnsiTheme="majorHAnsi" w:cstheme="majorHAnsi"/>
-          <w:sz w:val="24"/>
-          <w:szCs w:val="28"/>
-          <w:lang w:val="de-DE"/>
-        </w:rPr>
-        <w:t>Präsentation von Referenzprojekten.</w:t>
+        <w:t>Ergebnis: Professionelle Webpräsenz zur Präsentation von Referenzprojekten.</w:t>
       </w:r>
     </w:p>
     <w:p>
       <w:pPr>
+        <w:spacing w:after="40"/>
+        <w:rPr>
+          <w:rFonts w:asciiTheme="majorHAnsi" w:hAnsiTheme="majorHAnsi" w:cstheme="majorHAnsi"/>
+          <w:lang w:val="de-DE"/>
+        </w:rPr>
+      </w:pPr>
+    </w:p>
+    <w:p>
+      <w:pPr>
         <w:spacing w:after="0"/>
         <w:rPr>
           <w:rFonts w:asciiTheme="majorHAnsi" w:hAnsiTheme="majorHAnsi" w:cstheme="majorHAnsi"/>
-          <w:sz w:val="28"/>
-          <w:szCs w:val="28"/>
         </w:rPr>
       </w:pPr>
       <w:r>
         <w:rPr>
           <w:rFonts w:asciiTheme="majorHAnsi" w:hAnsiTheme="majorHAnsi" w:cstheme="majorHAnsi"/>
           <w:b/>
-          <w:sz w:val="24"/>
-          <w:szCs w:val="28"/>
-        </w:rPr>
-        <w:t>Road Shield Solutions – Firmenwebsite (seit 2026)</w:t>
+          <w:sz w:val="20"/>
+        </w:rPr>
+        <w:t>Road Shield Solutions – Firmenwebsite</w:t>
+      </w:r>
+      <w:r>
+        <w:rPr>
+          <w:rFonts w:asciiTheme="majorHAnsi" w:hAnsiTheme="majorHAnsi" w:cstheme="majorHAnsi"/>
+          <w:b/>
+          <w:sz w:val="20"/>
+        </w:rPr>
+        <w:t xml:space="preserve"> (seit 2026)</w:t>
       </w:r>
     </w:p>
     <w:p>
       <w:pPr>
         <w:pStyle w:val="Aufzhlungszeichen"/>
-        <w:spacing w:after="20"/>
-        <w:rPr>
-          <w:rFonts w:asciiTheme="majorHAnsi" w:hAnsiTheme="majorHAnsi" w:cstheme="majorHAnsi"/>
-          <w:sz w:val="28"/>
-          <w:szCs w:val="28"/>
+        <w:spacing w:after="0"/>
+        <w:rPr>
+          <w:rFonts w:asciiTheme="majorHAnsi" w:hAnsiTheme="majorHAnsi" w:cstheme="majorHAnsi"/>
         </w:rPr>
       </w:pPr>
       <w:r>
         <w:rPr>
           <w:rFonts w:asciiTheme="majorHAnsi" w:hAnsiTheme="majorHAnsi" w:cstheme="majorHAnsi"/>
-          <w:sz w:val="24"/>
-          <w:szCs w:val="28"/>
+          <w:sz w:val="20"/>
         </w:rPr>
         <w:t>Tech: HTML, CSS, JavaScript, Responsive Design, Git</w:t>
       </w:r>
@@ -1897,19 +1234,16 @@
     <w:p>
       <w:pPr>
         <w:pStyle w:val="Aufzhlungszeichen"/>
-        <w:spacing w:after="20"/>
-        <w:rPr>
-          <w:rFonts w:asciiTheme="majorHAnsi" w:hAnsiTheme="majorHAnsi" w:cstheme="majorHAnsi"/>
-          <w:sz w:val="28"/>
-          <w:szCs w:val="28"/>
+        <w:spacing w:after="0"/>
+        <w:rPr>
+          <w:rFonts w:asciiTheme="majorHAnsi" w:hAnsiTheme="majorHAnsi" w:cstheme="majorHAnsi"/>
           <w:lang w:val="de-DE"/>
         </w:rPr>
       </w:pPr>
       <w:r>
         <w:rPr>
           <w:rFonts w:asciiTheme="majorHAnsi" w:hAnsiTheme="majorHAnsi" w:cstheme="majorHAnsi"/>
-          <w:sz w:val="24"/>
-          <w:szCs w:val="28"/>
+          <w:sz w:val="20"/>
           <w:lang w:val="de-DE"/>
         </w:rPr>
         <w:t>Rolle: Frontend-Entwicklung und Content-Management für ein Bauunternehmen in Dubai.</w:t>
@@ -1918,60 +1252,35 @@
     <w:p>
       <w:pPr>
         <w:pStyle w:val="Aufzhlungszeichen"/>
-        <w:spacing w:after="20"/>
-        <w:rPr>
-          <w:rFonts w:asciiTheme="majorHAnsi" w:hAnsiTheme="majorHAnsi" w:cstheme="majorHAnsi"/>
-          <w:sz w:val="28"/>
-          <w:szCs w:val="28"/>
+        <w:spacing w:after="0"/>
+        <w:rPr>
+          <w:rFonts w:asciiTheme="majorHAnsi" w:hAnsiTheme="majorHAnsi" w:cstheme="majorHAnsi"/>
           <w:lang w:val="de-DE"/>
         </w:rPr>
       </w:pPr>
       <w:r>
         <w:rPr>
           <w:rFonts w:asciiTheme="majorHAnsi" w:hAnsiTheme="majorHAnsi" w:cstheme="majorHAnsi"/>
-          <w:sz w:val="24"/>
-          <w:szCs w:val="28"/>
+          <w:sz w:val="20"/>
           <w:lang w:val="de-DE"/>
         </w:rPr>
-        <w:t>Ergebnis: In Entwicklung – Fokus a</w:t>
-      </w:r>
-      <w:r>
-        <w:rPr>
-          <w:rFonts w:asciiTheme="majorHAnsi" w:hAnsiTheme="majorHAnsi" w:cstheme="majorHAnsi"/>
-          <w:sz w:val="24"/>
-          <w:szCs w:val="28"/>
-          <w:lang w:val="de-DE"/>
-        </w:rPr>
-        <w:t xml:space="preserve">uf UX und </w:t>
-      </w:r>
-      <w:proofErr w:type="spellStart"/>
-      <w:r>
-        <w:rPr>
-          <w:rFonts w:asciiTheme="majorHAnsi" w:hAnsiTheme="majorHAnsi" w:cstheme="majorHAnsi"/>
-          <w:sz w:val="24"/>
-          <w:szCs w:val="28"/>
-          <w:lang w:val="de-DE"/>
-        </w:rPr>
-        <w:t>responsive</w:t>
-      </w:r>
-      <w:proofErr w:type="spellEnd"/>
-      <w:r>
-        <w:rPr>
-          <w:rFonts w:asciiTheme="majorHAnsi" w:hAnsiTheme="majorHAnsi" w:cstheme="majorHAnsi"/>
-          <w:sz w:val="24"/>
-          <w:szCs w:val="28"/>
-          <w:lang w:val="de-DE"/>
-        </w:rPr>
-        <w:t xml:space="preserve"> Darstellung.</w:t>
+        <w:t>Ergebnis: In Entwicklung – Fokus auf UX und responsive Darstellung.</w:t>
       </w:r>
     </w:p>
     <w:p>
       <w:pPr>
+        <w:spacing w:after="40"/>
+        <w:rPr>
+          <w:rFonts w:asciiTheme="majorHAnsi" w:hAnsiTheme="majorHAnsi" w:cstheme="majorHAnsi"/>
+          <w:lang w:val="de-DE"/>
+        </w:rPr>
+      </w:pPr>
+    </w:p>
+    <w:p>
+      <w:pPr>
         <w:spacing w:before="120" w:after="40"/>
         <w:rPr>
           <w:rFonts w:asciiTheme="majorHAnsi" w:hAnsiTheme="majorHAnsi" w:cstheme="majorHAnsi"/>
-          <w:sz w:val="28"/>
-          <w:szCs w:val="28"/>
         </w:rPr>
       </w:pPr>
       <w:r>
@@ -1979,8 +1288,7 @@
           <w:rFonts w:asciiTheme="majorHAnsi" w:hAnsiTheme="majorHAnsi" w:cstheme="majorHAnsi"/>
           <w:b/>
           <w:color w:val="003366"/>
-          <w:sz w:val="32"/>
-          <w:szCs w:val="28"/>
+          <w:sz w:val="24"/>
         </w:rPr>
         <w:t>ZERTIFIKATE &amp; WEITERBILDUNG</w:t>
       </w:r>
@@ -1991,17 +1299,21 @@
         <w:spacing w:after="20"/>
         <w:rPr>
           <w:rFonts w:asciiTheme="majorHAnsi" w:hAnsiTheme="majorHAnsi" w:cstheme="majorHAnsi"/>
-          <w:sz w:val="28"/>
-          <w:szCs w:val="28"/>
         </w:rPr>
       </w:pPr>
       <w:r>
         <w:rPr>
           <w:rFonts w:asciiTheme="majorHAnsi" w:hAnsiTheme="majorHAnsi" w:cstheme="majorHAnsi"/>
-          <w:sz w:val="24"/>
-          <w:szCs w:val="28"/>
-        </w:rPr>
-        <w:t>Cisco Networking Academy: Cybersecurity Analyst, Python, JavaScript, IoT, Grundlagen Künstliche Intelligenz</w:t>
+          <w:sz w:val="20"/>
+        </w:rPr>
+        <w:t>Cisco Netw</w:t>
+      </w:r>
+      <w:r>
+        <w:rPr>
+          <w:rFonts w:asciiTheme="majorHAnsi" w:hAnsiTheme="majorHAnsi" w:cstheme="majorHAnsi"/>
+          <w:sz w:val="20"/>
+        </w:rPr>
+        <w:t>orking Academy: Cybersecurity Analyst, Python, JavaScript, IoT, Grundlagen Künstliche Intelligenz</w:t>
       </w:r>
     </w:p>
     <w:p>
@@ -2010,16 +1322,13 @@
         <w:spacing w:after="20"/>
         <w:rPr>
           <w:rFonts w:asciiTheme="majorHAnsi" w:hAnsiTheme="majorHAnsi" w:cstheme="majorHAnsi"/>
-          <w:sz w:val="28"/>
-          <w:szCs w:val="28"/>
           <w:lang w:val="de-DE"/>
         </w:rPr>
       </w:pPr>
       <w:r>
         <w:rPr>
           <w:rFonts w:asciiTheme="majorHAnsi" w:hAnsiTheme="majorHAnsi" w:cstheme="majorHAnsi"/>
-          <w:sz w:val="24"/>
-          <w:szCs w:val="28"/>
+          <w:sz w:val="20"/>
           <w:lang w:val="de-DE"/>
         </w:rPr>
         <w:t>Deutsch: B2 – Weststadt Akademie (2025) | B1 – DÜS Eckert (2024)</w:t>
@@ -2031,53 +1340,14 @@
         <w:spacing w:after="20"/>
         <w:rPr>
           <w:rFonts w:asciiTheme="majorHAnsi" w:hAnsiTheme="majorHAnsi" w:cstheme="majorHAnsi"/>
-          <w:sz w:val="28"/>
-          <w:szCs w:val="28"/>
-        </w:rPr>
-      </w:pPr>
-      <w:proofErr w:type="spellStart"/>
+        </w:rPr>
+      </w:pPr>
       <w:r>
         <w:rPr>
           <w:rFonts w:asciiTheme="majorHAnsi" w:hAnsiTheme="majorHAnsi" w:cstheme="majorHAnsi"/>
-          <w:sz w:val="24"/>
-          <w:szCs w:val="28"/>
-        </w:rPr>
-        <w:t>Jobcoaching</w:t>
-      </w:r>
-      <w:proofErr w:type="spellEnd"/>
-      <w:r>
-        <w:rPr>
-          <w:rFonts w:asciiTheme="majorHAnsi" w:hAnsiTheme="majorHAnsi" w:cstheme="majorHAnsi"/>
-          <w:sz w:val="24"/>
-          <w:szCs w:val="28"/>
-        </w:rPr>
-        <w:t xml:space="preserve"> &amp; </w:t>
-      </w:r>
-      <w:proofErr w:type="spellStart"/>
-      <w:r>
-        <w:rPr>
-          <w:rFonts w:asciiTheme="majorHAnsi" w:hAnsiTheme="majorHAnsi" w:cstheme="majorHAnsi"/>
-          <w:sz w:val="24"/>
-          <w:szCs w:val="28"/>
-        </w:rPr>
-        <w:t>Bewerbu</w:t>
-      </w:r>
-      <w:r>
-        <w:rPr>
-          <w:rFonts w:asciiTheme="majorHAnsi" w:hAnsiTheme="majorHAnsi" w:cstheme="majorHAnsi"/>
-          <w:sz w:val="24"/>
-          <w:szCs w:val="28"/>
-        </w:rPr>
-        <w:t>ngstraining</w:t>
-      </w:r>
-      <w:proofErr w:type="spellEnd"/>
-      <w:r>
-        <w:rPr>
-          <w:rFonts w:asciiTheme="majorHAnsi" w:hAnsiTheme="majorHAnsi" w:cstheme="majorHAnsi"/>
-          <w:sz w:val="24"/>
-          <w:szCs w:val="28"/>
-        </w:rPr>
-        <w:t xml:space="preserve"> – Weststadt Akademie (2024–2025)</w:t>
+          <w:sz w:val="20"/>
+        </w:rPr>
+        <w:t>Jobcoaching &amp; Bewerbungstraining – Weststadt Akademie (2024–2025)</w:t>
       </w:r>
     </w:p>
     <w:p>
@@ -2085,8 +1355,6 @@
         <w:spacing w:before="120" w:after="40"/>
         <w:rPr>
           <w:rFonts w:asciiTheme="majorHAnsi" w:hAnsiTheme="majorHAnsi" w:cstheme="majorHAnsi"/>
-          <w:sz w:val="28"/>
-          <w:szCs w:val="28"/>
         </w:rPr>
       </w:pPr>
       <w:r>
@@ -2094,8 +1362,7 @@
           <w:rFonts w:asciiTheme="majorHAnsi" w:hAnsiTheme="majorHAnsi" w:cstheme="majorHAnsi"/>
           <w:b/>
           <w:color w:val="003366"/>
-          <w:sz w:val="32"/>
-          <w:szCs w:val="28"/>
+          <w:sz w:val="24"/>
         </w:rPr>
         <w:t>SPRACHEN</w:t>
       </w:r>
@@ -2106,17 +1373,21 @@
         <w:spacing w:after="20"/>
         <w:rPr>
           <w:rFonts w:asciiTheme="majorHAnsi" w:hAnsiTheme="majorHAnsi" w:cstheme="majorHAnsi"/>
-          <w:sz w:val="28"/>
-          <w:szCs w:val="28"/>
         </w:rPr>
       </w:pPr>
       <w:r>
         <w:rPr>
           <w:rFonts w:asciiTheme="majorHAnsi" w:hAnsiTheme="majorHAnsi" w:cstheme="majorHAnsi"/>
-          <w:sz w:val="24"/>
-          <w:szCs w:val="28"/>
-        </w:rPr>
-        <w:t>Arabisch: Muttersprache</w:t>
+          <w:sz w:val="20"/>
+        </w:rPr>
+        <w:t>Arabisch: Muttersp</w:t>
+      </w:r>
+      <w:r>
+        <w:rPr>
+          <w:rFonts w:asciiTheme="majorHAnsi" w:hAnsiTheme="majorHAnsi" w:cstheme="majorHAnsi"/>
+          <w:sz w:val="20"/>
+        </w:rPr>
+        <w:t>rache</w:t>
       </w:r>
     </w:p>
     <w:p>
@@ -2125,15 +1396,12 @@
         <w:spacing w:after="20"/>
         <w:rPr>
           <w:rFonts w:asciiTheme="majorHAnsi" w:hAnsiTheme="majorHAnsi" w:cstheme="majorHAnsi"/>
-          <w:sz w:val="28"/>
-          <w:szCs w:val="28"/>
         </w:rPr>
       </w:pPr>
       <w:r>
         <w:rPr>
           <w:rFonts w:asciiTheme="majorHAnsi" w:hAnsiTheme="majorHAnsi" w:cstheme="majorHAnsi"/>
-          <w:sz w:val="24"/>
-          <w:szCs w:val="28"/>
+          <w:sz w:val="20"/>
         </w:rPr>
         <w:t>Deutsch: B2 (Fortgeschritten)</w:t>
       </w:r>
@@ -2144,15 +1412,12 @@
         <w:spacing w:after="20"/>
         <w:rPr>
           <w:rFonts w:asciiTheme="majorHAnsi" w:hAnsiTheme="majorHAnsi" w:cstheme="majorHAnsi"/>
-          <w:sz w:val="28"/>
-          <w:szCs w:val="28"/>
         </w:rPr>
       </w:pPr>
       <w:r>
         <w:rPr>
           <w:rFonts w:asciiTheme="majorHAnsi" w:hAnsiTheme="majorHAnsi" w:cstheme="majorHAnsi"/>
-          <w:sz w:val="24"/>
-          <w:szCs w:val="28"/>
+          <w:sz w:val="20"/>
         </w:rPr>
         <w:t>Englisch: Fortgeschritten (Berufssprache)</w:t>
       </w:r>
@@ -2163,19 +1428,16 @@
         <w:spacing w:after="20"/>
         <w:rPr>
           <w:rFonts w:asciiTheme="majorHAnsi" w:hAnsiTheme="majorHAnsi" w:cstheme="majorHAnsi"/>
-          <w:sz w:val="28"/>
-          <w:szCs w:val="28"/>
         </w:rPr>
       </w:pPr>
       <w:r>
         <w:rPr>
           <w:rFonts w:asciiTheme="majorHAnsi" w:hAnsiTheme="majorHAnsi" w:cstheme="majorHAnsi"/>
-          <w:sz w:val="24"/>
-          <w:szCs w:val="28"/>
-        </w:rPr>
-        <w:lastRenderedPageBreak/>
+          <w:sz w:val="20"/>
+        </w:rPr>
         <w:t>Französisch: Grundkenntnisse</w:t>
       </w:r>
+      <w:bookmarkEnd w:id="0"/>
     </w:p>
     <w:sectPr>
       <w:pgSz w:w="12240" w:h="15840"/>
@@ -14093,7 +13355,7 @@
 </file>
 
 <file path=customXml/itemProps1.xml><?xml version="1.0" encoding="utf-8"?>
-<ds:datastoreItem xmlns:ds="http://schemas.openxmlformats.org/officeDocument/2006/customXml" ds:itemID="{01FD93FD-6714-46C9-ADF2-493D17C55A03}">
+<ds:datastoreItem xmlns:ds="http://schemas.openxmlformats.org/officeDocument/2006/customXml" ds:itemID="{7AE0CCB3-40D9-4C61-BF59-539D4A103187}">
   <ds:schemaRefs>
     <ds:schemaRef ds:uri="http://schemas.openxmlformats.org/officeDocument/2006/bibliography"/>
   </ds:schemaRefs>

</xml_diff>